<commit_message>
Fix evidence floor reason keys in retention tests
Update assertion strings in test_control_plane_evidence_service.py to match renamed reason keys: `reproducibility_evidence_within_retention` → `reproducibility_evidence_floor_satisfied` (pass case) and `reproducibility_evidence_floor_unprotected` (fail case). Also refreshes source_tree_sha256 in module-coverage-inventory.json, adds two QPCT/QPCTL consolidated report docx files, updates the CD47–SIRPα clinical report docx, and adds an episodic memory summary for the merge-conflict resolution task.
</commit_message>
<xml_diff>
--- a/scripts/engineering/dev/Клиническая эффективность терапии оси CD47–SIRPα.docx
+++ b/scripts/engineering/dev/Клиническая эффективность терапии оси CD47–SIRPα.docx
@@ -1,6 +1,6 @@
 
 <file path=word/document.xml><?xml version="1.0" encoding="utf-8"?>
-<w:document xmlns:wpc="http://schemas.microsoft.com/office/word/2010/wordprocessingCanvas" xmlns:cx="http://schemas.microsoft.com/office/drawing/2014/chartex" xmlns:cx1="http://schemas.microsoft.com/office/drawing/2015/9/8/chartex" xmlns:mc="http://schemas.openxmlformats.org/markup-compatibility/2006" xmlns:o="urn:schemas-microsoft-com:office:office" xmlns:r="http://schemas.openxmlformats.org/officeDocument/2006/relationships" xmlns:m="http://schemas.openxmlformats.org/officeDocument/2006/math" xmlns:v="urn:schemas-microsoft-com:vml" xmlns:wp14="http://schemas.microsoft.com/office/word/2010/wordprocessingDrawing" xmlns:wp="http://schemas.openxmlformats.org/drawingml/2006/wordprocessingDrawing" xmlns:w10="urn:schemas-microsoft-com:office:word" xmlns:w="http://schemas.openxmlformats.org/wordprocessingml/2006/main" xmlns:w14="http://schemas.microsoft.com/office/word/2010/wordml" xmlns:w15="http://schemas.microsoft.com/office/word/2012/wordml" xmlns:w16se="http://schemas.microsoft.com/office/word/2015/wordml/symex" xmlns:wpg="http://schemas.microsoft.com/office/word/2010/wordprocessingGroup" xmlns:wpi="http://schemas.microsoft.com/office/word/2010/wordprocessingInk" xmlns:wne="http://schemas.microsoft.com/office/word/2006/wordml" xmlns:wps="http://schemas.microsoft.com/office/word/2010/wordprocessingShape" mc:Ignorable="w14 w15 w16se wp14">
+<w:document xmlns:wpc="http://schemas.microsoft.com/office/word/2010/wordprocessingCanvas" xmlns:cx="http://schemas.microsoft.com/office/drawing/2014/chartex" xmlns:mc="http://schemas.openxmlformats.org/markup-compatibility/2006" xmlns:o="urn:schemas-microsoft-com:office:office" xmlns:r="http://schemas.openxmlformats.org/officeDocument/2006/relationships" xmlns:m="http://schemas.openxmlformats.org/officeDocument/2006/math" xmlns:v="urn:schemas-microsoft-com:vml" xmlns:wp14="http://schemas.microsoft.com/office/word/2010/wordprocessingDrawing" xmlns:wp="http://schemas.openxmlformats.org/drawingml/2006/wordprocessingDrawing" xmlns:w10="urn:schemas-microsoft-com:office:word" xmlns:w="http://schemas.openxmlformats.org/wordprocessingml/2006/main" xmlns:w14="http://schemas.microsoft.com/office/word/2010/wordml" xmlns:w15="http://schemas.microsoft.com/office/word/2012/wordml" xmlns:w16se="http://schemas.microsoft.com/office/word/2015/wordml/symex" xmlns:wpg="http://schemas.microsoft.com/office/word/2010/wordprocessingGroup" xmlns:wpi="http://schemas.microsoft.com/office/word/2010/wordprocessingInk" xmlns:wne="http://schemas.microsoft.com/office/word/2006/wordml" xmlns:wps="http://schemas.microsoft.com/office/word/2010/wordprocessingShape" mc:Ignorable="w14 w15 w16se wp14">
   <w:body>
     <w:p>
       <w:pPr>
@@ -9,9 +9,9 @@
         <w:rPr>
           <w:rFonts w:ascii="Times New Roman" w:hAnsi="Times New Roman" w:cs="Times New Roman"/>
           <w:szCs w:val="24"/>
+          <w:lang w:val="ru-RU"/>
         </w:rPr>
       </w:pPr>
-      <w:bookmarkStart w:id="0" w:name="_GoBack"/>
       <w:r>
         <w:rPr>
           <w:rFonts w:ascii="Times New Roman" w:hAnsi="Times New Roman" w:cs="Times New Roman"/>
@@ -42,7 +42,6 @@
         </w:rPr>
         <w:t>SIRPα</w:t>
       </w:r>
-      <w:bookmarkEnd w:id="0"/>
     </w:p>
     <w:tbl>
       <w:tblPr>
@@ -778,14 +777,7 @@
         <w:rPr>
           <w:lang w:val="ru-RU"/>
         </w:rPr>
-        <w:t xml:space="preserve">47-терапии обеспечивало бы </w:t>
-      </w:r>
-      <w:r>
-        <w:rPr>
-          <w:lang w:val="ru-RU"/>
-        </w:rPr>
-        <w:lastRenderedPageBreak/>
-        <w:t>статистически и клинически убедительное улучшение выживаемости или другого значимого для пациента исхода по сравнению с адекватной стандартной терапией.</w:t>
+        <w:t>47-терапии обеспечивало бы статистически и клинически убедительное улучшение выживаемости или другого значимого для пациента исхода по сравнению с адекватной стандартной терапией.</w:t>
       </w:r>
     </w:p>
     <w:p>
@@ -1031,14 +1023,7 @@
         <w:rPr>
           <w:lang w:val="ru-RU"/>
         </w:rPr>
-        <w:t xml:space="preserve"> при метастатическом колоректальном раке. </w:t>
-      </w:r>
-      <w:r>
-        <w:rPr>
-          <w:lang w:val="ru-RU"/>
-        </w:rPr>
-        <w:lastRenderedPageBreak/>
-        <w:t xml:space="preserve">Комбинация </w:t>
+        <w:t xml:space="preserve"> при метастатическом колоректальном раке. Комбинация </w:t>
       </w:r>
       <w:r>
         <w:t>magrolimab</w:t>
@@ -1266,7 +1251,6 @@
         <w:rPr>
           <w:lang w:val="ru-RU"/>
         </w:rPr>
-        <w:lastRenderedPageBreak/>
         <w:t xml:space="preserve">В целом клинические данные подтверждают, что блокада </w:t>
       </w:r>
       <w:r>
@@ -1354,7 +1338,6 @@
         <w:pStyle w:val="Heading2"/>
       </w:pPr>
       <w:r>
-        <w:lastRenderedPageBreak/>
         <w:t>ЛАНДШАФТ ПРЕПАРАТОВ И МАТРИЦА ЭФФЕКТИВНОСТИ</w:t>
       </w:r>
     </w:p>
@@ -3192,7 +3175,6 @@
                 <w:sz w:val="20"/>
                 <w:szCs w:val="20"/>
               </w:rPr>
-              <w:lastRenderedPageBreak/>
               <w:t>CC-90002</w:t>
             </w:r>
           </w:p>
@@ -5507,7 +5489,6 @@
                 <w:sz w:val="20"/>
                 <w:szCs w:val="20"/>
               </w:rPr>
-              <w:lastRenderedPageBreak/>
               <w:t>GS-0189</w:t>
             </w:r>
           </w:p>
@@ -6307,91 +6288,7 @@
         <w:rPr>
           <w:lang w:val="ru-RU"/>
         </w:rPr>
-        <w:t xml:space="preserve">При оценке препаратов, воздействующих на ось </w:t>
-      </w:r>
-      <w:r>
-        <w:rPr>
-          <w:lang w:val="ru-RU"/>
-        </w:rPr>
-        <w:t>CD</w:t>
-      </w:r>
-      <w:r>
-        <w:rPr>
-          <w:lang w:val="ru-RU"/>
-        </w:rPr>
-        <w:t>47–</w:t>
-      </w:r>
-      <w:r>
-        <w:rPr>
-          <w:lang w:val="ru-RU"/>
-        </w:rPr>
-        <w:t>SIRPα</w:t>
-      </w:r>
-      <w:r>
-        <w:rPr>
-          <w:lang w:val="ru-RU"/>
-        </w:rPr>
-        <w:t xml:space="preserve">, необходимо разделять несколько принципиально разных подходов: прямые антитела к </w:t>
-      </w:r>
-      <w:r>
-        <w:rPr>
-          <w:lang w:val="ru-RU"/>
-        </w:rPr>
-        <w:t>CD</w:t>
-      </w:r>
-      <w:r>
-        <w:rPr>
-          <w:lang w:val="ru-RU"/>
-        </w:rPr>
-        <w:t xml:space="preserve">47, </w:t>
-      </w:r>
-      <w:r>
-        <w:rPr>
-          <w:lang w:val="ru-RU"/>
-        </w:rPr>
-        <w:t>SIRPα</w:t>
-      </w:r>
-      <w:r>
-        <w:rPr>
-          <w:lang w:val="ru-RU"/>
-        </w:rPr>
-        <w:t xml:space="preserve">-декой/фьюжн-белки, связывающие </w:t>
-      </w:r>
-      <w:r>
-        <w:rPr>
-          <w:lang w:val="ru-RU"/>
-        </w:rPr>
-        <w:t>CD</w:t>
-      </w:r>
-      <w:r>
-        <w:rPr>
-          <w:lang w:val="ru-RU"/>
-        </w:rPr>
-        <w:t xml:space="preserve">47, а также препараты, направленные на </w:t>
-      </w:r>
-      <w:r>
-        <w:rPr>
-          <w:lang w:val="ru-RU"/>
-        </w:rPr>
-        <w:t>SIRPα</w:t>
-      </w:r>
-      <w:r>
-        <w:rPr>
-          <w:lang w:val="ru-RU"/>
-        </w:rPr>
-        <w:t xml:space="preserve"> или использующие биспецифические и условно активируемые конструкции. Клинические результаты одного формата не могут автоматически переноситься на другие варианты терапии, поскольку они различаются по структуре </w:t>
-      </w:r>
-      <w:r>
-        <w:rPr>
-          <w:lang w:val="ru-RU"/>
-        </w:rPr>
-        <w:t>Fc</w:t>
-      </w:r>
-      <w:r>
-        <w:rPr>
-          <w:lang w:val="ru-RU"/>
-        </w:rPr>
-        <w:t>-фрагмента, силе связывания с мишенью, взаимодействию с нормальными клетками крови и необходимости дополнительного сигнала активации фагоцитоза.</w:t>
+        <w:t>При оценке препаратов, воздействующих на ось CD47–SIRPα, необходимо разделять несколько принципиально разных подходов: прямые антитела к CD47, SIRPα-декой/фьюжн-белки, связывающие CD47, а также препараты, направленные на SIRPα или использующие биспецифические и условно активируемые конструкции. Клинические результаты одного формата не могут автоматически переноситься на другие варианты терапии, поскольку они различаются по структуре Fc-фрагмента, силе связывания с мишенью, взаимодействию с нормальными клетками крови и необходимости дополнительного сигнала активации фагоцитоза.</w:t>
       </w:r>
     </w:p>
     <w:p>
@@ -6404,145 +6301,7 @@
         <w:rPr>
           <w:lang w:val="ru-RU"/>
         </w:rPr>
-        <w:t xml:space="preserve">Например, </w:t>
-      </w:r>
-      <w:r>
-        <w:rPr>
-          <w:lang w:val="ru-RU"/>
-        </w:rPr>
-        <w:t>TTI</w:t>
-      </w:r>
-      <w:r>
-        <w:rPr>
-          <w:lang w:val="ru-RU"/>
-        </w:rPr>
-        <w:t xml:space="preserve">-621 представляет собой фьюжн-белок </w:t>
-      </w:r>
-      <w:r>
-        <w:rPr>
-          <w:lang w:val="ru-RU"/>
-        </w:rPr>
-        <w:t>SIRPα</w:t>
-      </w:r>
-      <w:r>
-        <w:rPr>
-          <w:lang w:val="ru-RU"/>
-        </w:rPr>
-        <w:t>–</w:t>
-      </w:r>
-      <w:r>
-        <w:rPr>
-          <w:lang w:val="ru-RU"/>
-        </w:rPr>
-        <w:t>IgG</w:t>
-      </w:r>
-      <w:r>
-        <w:rPr>
-          <w:lang w:val="ru-RU"/>
-        </w:rPr>
-        <w:t xml:space="preserve">1 </w:t>
-      </w:r>
-      <w:r>
-        <w:rPr>
-          <w:lang w:val="ru-RU"/>
-        </w:rPr>
-        <w:t>Fc</w:t>
-      </w:r>
-      <w:r>
-        <w:rPr>
-          <w:lang w:val="ru-RU"/>
-        </w:rPr>
-        <w:t xml:space="preserve"> с активным </w:t>
-      </w:r>
-      <w:r>
-        <w:rPr>
-          <w:lang w:val="ru-RU"/>
-        </w:rPr>
-        <w:t>FcγR</w:t>
-      </w:r>
-      <w:r>
-        <w:rPr>
-          <w:lang w:val="ru-RU"/>
-        </w:rPr>
-        <w:t xml:space="preserve">-сигналом, тогда как </w:t>
-      </w:r>
-      <w:r>
-        <w:rPr>
-          <w:lang w:val="ru-RU"/>
-        </w:rPr>
-        <w:t>evorpacept</w:t>
-      </w:r>
-      <w:r>
-        <w:rPr>
-          <w:lang w:val="ru-RU"/>
-        </w:rPr>
-        <w:t xml:space="preserve"> является высокоаффинным блокатором </w:t>
-      </w:r>
-      <w:r>
-        <w:rPr>
-          <w:lang w:val="ru-RU"/>
-        </w:rPr>
-        <w:t>CD</w:t>
-      </w:r>
-      <w:r>
-        <w:rPr>
-          <w:lang w:val="ru-RU"/>
-        </w:rPr>
-        <w:t xml:space="preserve">47 на основе </w:t>
-      </w:r>
-      <w:r>
-        <w:rPr>
-          <w:lang w:val="ru-RU"/>
-        </w:rPr>
-        <w:t>SIRPα</w:t>
-      </w:r>
-      <w:r>
-        <w:rPr>
-          <w:lang w:val="ru-RU"/>
-        </w:rPr>
-        <w:t xml:space="preserve"> с инактивированным </w:t>
-      </w:r>
-      <w:r>
-        <w:rPr>
-          <w:lang w:val="ru-RU"/>
-        </w:rPr>
-        <w:t>Fc</w:t>
-      </w:r>
-      <w:r>
-        <w:rPr>
-          <w:lang w:val="ru-RU"/>
-        </w:rPr>
-        <w:t xml:space="preserve">-фрагментом. Эти различия могут существенно влиять как на противоопухолевую активность, так и на профиль токсичности препаратов. Поэтому отсутствие эффективности или наличие токсичности у одного класса препаратов не является достаточным основанием для вывода о неэффективности всей стратегии воздействия на ось </w:t>
-      </w:r>
-      <w:r>
-        <w:rPr>
-          <w:lang w:val="ru-RU"/>
-        </w:rPr>
-        <w:t>CD</w:t>
-      </w:r>
-      <w:r>
-        <w:rPr>
-          <w:lang w:val="ru-RU"/>
-        </w:rPr>
-        <w:t>47–</w:t>
-      </w:r>
-      <w:r>
-        <w:rPr>
-          <w:lang w:val="ru-RU"/>
-        </w:rPr>
-        <w:t>SIRPα</w:t>
-      </w:r>
-      <w:r>
-        <w:rPr>
-          <w:lang w:val="ru-RU"/>
-        </w:rPr>
-        <w:t xml:space="preserve">. </w:t>
-      </w:r>
-      <w:r>
-        <w:rPr>
-          <w:lang w:val="ru-RU"/>
-        </w:rPr>
-        <w:t>[10–12]</w:t>
+        <w:t>Например, TTI-621 представляет собой фьюжн-белок SIRPα–IgG1 Fc с активным FcγR-сигналом, тогда как evorpacept является высокоаффинным блокатором CD47 на основе SIRPα с инактивированным Fc-фрагментом. Эти различия могут существенно влиять как на противоопухолевую активность, так и на профиль токсичности препаратов. Поэтому отсутствие эффективности или наличие токсичности у одного класса препаратов не является достаточным основанием для вывода о неэффективности всей стратегии воздействия на ось CD47–SIRPα. [10–12]</w:t>
       </w:r>
     </w:p>
     <w:tbl>
@@ -6591,7 +6350,6 @@
                 <w:sz w:val="22"/>
                 <w:szCs w:val="20"/>
               </w:rPr>
-              <w:lastRenderedPageBreak/>
               <w:t>Показание</w:t>
             </w:r>
           </w:p>
@@ -7445,23 +7203,7 @@
                 <w:szCs w:val="20"/>
                 <w:lang w:val="ru-RU"/>
               </w:rPr>
-              <w:t>Поисков</w:t>
-            </w:r>
-            <w:r>
-              <w:rPr>
-                <w:sz w:val="20"/>
-                <w:szCs w:val="20"/>
-                <w:lang w:val="ru-RU"/>
-              </w:rPr>
-              <w:t xml:space="preserve">ые </w:t>
-            </w:r>
-            <w:r>
-              <w:rPr>
-                <w:sz w:val="20"/>
-                <w:szCs w:val="20"/>
-                <w:lang w:val="ru-RU"/>
-              </w:rPr>
-              <w:t xml:space="preserve">Исследования </w:t>
+              <w:t xml:space="preserve">Поисковые Исследования </w:t>
             </w:r>
             <w:r>
               <w:rPr>
@@ -8219,7 +7961,6 @@
                 <w:szCs w:val="20"/>
                 <w:lang w:val="ru-RU"/>
               </w:rPr>
-              <w:lastRenderedPageBreak/>
               <w:t>Рефрактерный микросателлитно-стабильный колоректальный рак</w:t>
             </w:r>
           </w:p>
@@ -8302,22 +8043,16 @@
               <w:rPr>
                 <w:sz w:val="20"/>
                 <w:szCs w:val="20"/>
-              </w:rPr>
-            </w:pPr>
-            <w:r>
-              <w:rPr>
-                <w:sz w:val="20"/>
-                <w:szCs w:val="20"/>
-                <w:lang w:val="ru-RU"/>
-              </w:rPr>
-              <w:t xml:space="preserve">Частота объективного ответа 6,3%; медиана выживаемости без прогрессирования 2,3 мес. Зарегистрированы два связанных с лечением нежелательных явления 5-й степени, то есть со смертельным исходом. </w:t>
-            </w:r>
-            <w:r>
-              <w:rPr>
-                <w:sz w:val="20"/>
-                <w:szCs w:val="20"/>
-              </w:rPr>
-              <w:t>Набор пациентов прекращен [32]</w:t>
+                <w:lang w:val="ru-RU"/>
+              </w:rPr>
+            </w:pPr>
+            <w:r>
+              <w:rPr>
+                <w:sz w:val="20"/>
+                <w:szCs w:val="20"/>
+                <w:lang w:val="ru-RU"/>
+              </w:rPr>
+              <w:t>Частота объективного ответа 6,3%; медиана выживаемости без прогрессирования 2,3 мес. Зарегистрированы два связанных с лечением нежелательных явления 5-й степени, то есть со смертельным исходом. Набор пациентов прекращен [32]</w:t>
             </w:r>
           </w:p>
         </w:tc>
@@ -9328,7 +9063,6 @@
                 <w:szCs w:val="20"/>
                 <w:lang w:val="ru-RU"/>
               </w:rPr>
-              <w:lastRenderedPageBreak/>
               <w:t>Неотобранные пациенты с распространенными солидными опухолями</w:t>
             </w:r>
           </w:p>
@@ -9807,7 +9541,6 @@
         <w:pStyle w:val="Heading2"/>
       </w:pPr>
       <w:r>
-        <w:lastRenderedPageBreak/>
         <w:t>ГЕМАТОЛОГИЧЕСКИЕ ЗАБОЛЕВАНИЯ И ЭВОЛЮЦИЯ MDS/AML</w:t>
       </w:r>
     </w:p>
@@ -10498,7 +10231,6 @@
           <w:sz w:val="22"/>
           <w:lang w:val="ru-RU"/>
         </w:rPr>
-        <w:lastRenderedPageBreak/>
         <w:t xml:space="preserve">Несмотря на эти положительные сигналы, наиболее зрелые рандомизированные данные при </w:t>
       </w:r>
       <w:r>
@@ -11238,15 +10970,7 @@
           <w:sz w:val="22"/>
           <w:lang w:val="ru-RU"/>
         </w:rPr>
-        <w:t xml:space="preserve">47 непосредственно вызывает инфекции. </w:t>
-      </w:r>
-      <w:r>
-        <w:rPr>
-          <w:sz w:val="22"/>
-          <w:lang w:val="ru-RU"/>
-        </w:rPr>
-        <w:lastRenderedPageBreak/>
-        <w:t>Повышенная смертность могла быть связана с глубиной и продолжительностью цитопении, иммунной модуляцией, длительностью терапии или взаимодействием препаратов. [3]</w:t>
+        <w:t>47 непосредственно вызывает инфекции. Повышенная смертность могла быть связана с глубиной и продолжительностью цитопении, иммунной модуляцией, длительностью терапии или взаимодействием препаратов. [3]</w:t>
       </w:r>
     </w:p>
     <w:p>
@@ -11516,7 +11240,6 @@
         <w:pStyle w:val="Heading2"/>
       </w:pPr>
       <w:r>
-        <w:lastRenderedPageBreak/>
         <w:t>СОЛИДНЫЕ ОПУХОЛИ, ОТРИЦАТЕЛЬНЫЕ И ПРЕКРАЩЁННЫЕ ПРОГРАММЫ</w:t>
       </w:r>
     </w:p>
@@ -11629,15 +11352,7 @@
           <w:sz w:val="22"/>
           <w:lang w:val="ru-RU"/>
         </w:rPr>
-        <w:t xml:space="preserve">При колоректальном раке (CRC) результаты также в основном не подтвердили выраженной активности, однако сила выводов различается между исследованиями. В исследовании magrolimab + cetuximab у пациентов после терапии anti-EGFR ORR составила 6,3% в KRAS wild-type и 0% в KRAS-mutated группах. Частота анемии степени ≥3, связанной с лечением, составила 11,5%. Отсутствие контрольной группы с одним cetuximab ограничивает </w:t>
-      </w:r>
-      <w:r>
-        <w:rPr>
-          <w:sz w:val="22"/>
-          <w:lang w:val="ru-RU"/>
-        </w:rPr>
-        <w:lastRenderedPageBreak/>
-        <w:t>интерпретацию: результаты указывают на низкую активность данной комбинации, но не являются строгим доказательством неэффективности magrolimab в CRC. [31]</w:t>
+        <w:t>При колоректальном раке (CRC) результаты также в основном не подтвердили выраженной активности, однако сила выводов различается между исследованиями. В исследовании magrolimab + cetuximab у пациентов после терапии anti-EGFR ORR составила 6,3% в KRAS wild-type и 0% в KRAS-mutated группах. Частота анемии степени ≥3, связанной с лечением, составила 11,5%. Отсутствие контрольной группы с одним cetuximab ограничивает интерпретацию: результаты указывают на низкую активность данной комбинации, но не являются строгим доказательством неэффективности magrolimab в CRC. [31]</w:t>
       </w:r>
     </w:p>
     <w:p>
@@ -11749,15 +11464,7 @@
           <w:sz w:val="22"/>
           <w:lang w:val="ru-RU"/>
         </w:rPr>
-        <w:t xml:space="preserve">Для рака легкого зрелых контролируемых данных, позволяющих надежно оценить эффективность прямой блокады CD47, пока недостаточно. Аналогичная ситуация сохраняется для большинства исследований при гепатоцеллюлярном раке, уротелиальном раке и других редких солидных опухолях, где доступны преимущественно небольшие исследования фазы I. Единичные </w:t>
-      </w:r>
-      <w:r>
-        <w:rPr>
-          <w:sz w:val="22"/>
-          <w:lang w:val="ru-RU"/>
-        </w:rPr>
-        <w:lastRenderedPageBreak/>
-        <w:t>частичные ответы в таких комбинациях следует рассматривать как предварительные сигналы активности, но не как подтверждение клинической эффективности.</w:t>
+        <w:t>Для рака легкого зрелых контролируемых данных, позволяющих надежно оценить эффективность прямой блокады CD47, пока недостаточно. Аналогичная ситуация сохраняется для большинства исследований при гепатоцеллюлярном раке, уротелиальном раке и других редких солидных опухолях, где доступны преимущественно небольшие исследования фазы I. Единичные частичные ответы в таких комбинациях следует рассматривать как предварительные сигналы активности, но не как подтверждение клинической эффективности.</w:t>
       </w:r>
     </w:p>
     <w:p>
@@ -11815,7 +11522,6 @@
         <w:pStyle w:val="Heading2"/>
       </w:pPr>
       <w:r>
-        <w:lastRenderedPageBreak/>
         <w:t>ОТРИЦАТЕЛЬНЫЕ И ПРЕКРАЩЁННЫЕ ИССЛЕДОВАНИЯ</w:t>
       </w:r>
     </w:p>
@@ -11831,11 +11537,11 @@
         <w:tblLook w:val="04A0" w:firstRow="1" w:lastRow="0" w:firstColumn="1" w:lastColumn="0" w:noHBand="0" w:noVBand="1"/>
       </w:tblPr>
       <w:tblGrid>
-        <w:gridCol w:w="1826"/>
-        <w:gridCol w:w="4046"/>
-        <w:gridCol w:w="1126"/>
-        <w:gridCol w:w="2485"/>
-        <w:gridCol w:w="5219"/>
+        <w:gridCol w:w="1797"/>
+        <w:gridCol w:w="3980"/>
+        <w:gridCol w:w="1108"/>
+        <w:gridCol w:w="2444"/>
+        <w:gridCol w:w="5135"/>
       </w:tblGrid>
       <w:tr>
         <w:tc>
@@ -11851,7 +11557,6 @@
               <w:rPr>
                 <w:sz w:val="24"/>
                 <w:szCs w:val="24"/>
-                <w:highlight w:val="yellow"/>
               </w:rPr>
             </w:pPr>
             <w:r>
@@ -11859,7 +11564,6 @@
                 <w:b/>
                 <w:sz w:val="24"/>
                 <w:szCs w:val="24"/>
-                <w:highlight w:val="yellow"/>
               </w:rPr>
               <w:t>Препарат</w:t>
             </w:r>
@@ -11878,7 +11582,6 @@
               <w:rPr>
                 <w:sz w:val="24"/>
                 <w:szCs w:val="24"/>
-                <w:highlight w:val="yellow"/>
               </w:rPr>
             </w:pPr>
             <w:r>
@@ -11886,7 +11589,6 @@
                 <w:b/>
                 <w:sz w:val="24"/>
                 <w:szCs w:val="24"/>
-                <w:highlight w:val="yellow"/>
               </w:rPr>
               <w:t>Показание / study</w:t>
             </w:r>
@@ -11905,7 +11607,6 @@
               <w:rPr>
                 <w:sz w:val="24"/>
                 <w:szCs w:val="24"/>
-                <w:highlight w:val="yellow"/>
               </w:rPr>
             </w:pPr>
             <w:r>
@@ -11913,7 +11614,6 @@
                 <w:b/>
                 <w:sz w:val="24"/>
                 <w:szCs w:val="24"/>
-                <w:highlight w:val="yellow"/>
               </w:rPr>
               <w:t>n</w:t>
             </w:r>
@@ -11932,7 +11632,6 @@
               <w:rPr>
                 <w:sz w:val="24"/>
                 <w:szCs w:val="24"/>
-                <w:highlight w:val="yellow"/>
               </w:rPr>
             </w:pPr>
             <w:r>
@@ -11940,7 +11639,6 @@
                 <w:b/>
                 <w:sz w:val="24"/>
                 <w:szCs w:val="24"/>
-                <w:highlight w:val="yellow"/>
               </w:rPr>
               <w:t>Primary endpoint / результат</w:t>
             </w:r>
@@ -11959,7 +11657,6 @@
               <w:rPr>
                 <w:sz w:val="24"/>
                 <w:szCs w:val="24"/>
-                <w:highlight w:val="yellow"/>
                 <w:lang w:val="ru-RU"/>
               </w:rPr>
             </w:pPr>
@@ -11968,7 +11665,6 @@
                 <w:b/>
                 <w:sz w:val="24"/>
                 <w:szCs w:val="24"/>
-                <w:highlight w:val="yellow"/>
                 <w:lang w:val="ru-RU"/>
               </w:rPr>
               <w:t>Почему прекращено или не продолжено</w:t>
@@ -11990,14 +11686,12 @@
               <w:rPr>
                 <w:sz w:val="24"/>
                 <w:szCs w:val="24"/>
-                <w:highlight w:val="yellow"/>
               </w:rPr>
             </w:pPr>
             <w:r>
               <w:rPr>
                 <w:sz w:val="24"/>
                 <w:szCs w:val="24"/>
-                <w:highlight w:val="yellow"/>
               </w:rPr>
               <w:t>magrolimab</w:t>
             </w:r>
@@ -12016,14 +11710,12 @@
               <w:rPr>
                 <w:sz w:val="24"/>
                 <w:szCs w:val="24"/>
-                <w:highlight w:val="yellow"/>
               </w:rPr>
             </w:pPr>
             <w:r>
               <w:rPr>
                 <w:sz w:val="24"/>
                 <w:szCs w:val="24"/>
-                <w:highlight w:val="yellow"/>
               </w:rPr>
               <w:t>HR-MDS, ENHANCE NCT04313881</w:t>
             </w:r>
@@ -12042,14 +11734,12 @@
               <w:rPr>
                 <w:sz w:val="24"/>
                 <w:szCs w:val="24"/>
-                <w:highlight w:val="yellow"/>
               </w:rPr>
             </w:pPr>
             <w:r>
               <w:rPr>
                 <w:sz w:val="24"/>
                 <w:szCs w:val="24"/>
-                <w:highlight w:val="yellow"/>
               </w:rPr>
               <w:t>539</w:t>
             </w:r>
@@ -12068,14 +11758,12 @@
               <w:rPr>
                 <w:sz w:val="24"/>
                 <w:szCs w:val="24"/>
-                <w:highlight w:val="yellow"/>
               </w:rPr>
             </w:pPr>
             <w:r>
               <w:rPr>
                 <w:sz w:val="24"/>
                 <w:szCs w:val="24"/>
-                <w:highlight w:val="yellow"/>
               </w:rPr>
               <w:t>CR 21,3% vs 23,6%; OS HR 1,203</w:t>
             </w:r>
@@ -12094,14 +11782,12 @@
               <w:rPr>
                 <w:sz w:val="24"/>
                 <w:szCs w:val="24"/>
-                <w:highlight w:val="yellow"/>
               </w:rPr>
             </w:pPr>
             <w:r>
               <w:rPr>
                 <w:sz w:val="24"/>
                 <w:szCs w:val="24"/>
-                <w:highlight w:val="yellow"/>
               </w:rPr>
               <w:t>prespecified futility / endpoints not met [1]; D, высокая</w:t>
             </w:r>
@@ -12122,14 +11808,12 @@
               <w:rPr>
                 <w:sz w:val="24"/>
                 <w:szCs w:val="24"/>
-                <w:highlight w:val="yellow"/>
               </w:rPr>
             </w:pPr>
             <w:r>
               <w:rPr>
                 <w:sz w:val="24"/>
                 <w:szCs w:val="24"/>
-                <w:highlight w:val="yellow"/>
               </w:rPr>
               <w:t>magrolimab</w:t>
             </w:r>
@@ -12148,14 +11832,12 @@
               <w:rPr>
                 <w:sz w:val="24"/>
                 <w:szCs w:val="24"/>
-                <w:highlight w:val="yellow"/>
               </w:rPr>
             </w:pPr>
             <w:r>
               <w:rPr>
                 <w:sz w:val="24"/>
                 <w:szCs w:val="24"/>
-                <w:highlight w:val="yellow"/>
               </w:rPr>
               <w:t>TP53-mut AML, ENHANCE-2 NCT04778397</w:t>
             </w:r>
@@ -12174,14 +11856,12 @@
               <w:rPr>
                 <w:sz w:val="24"/>
                 <w:szCs w:val="24"/>
-                <w:highlight w:val="yellow"/>
               </w:rPr>
             </w:pPr>
             <w:r>
               <w:rPr>
                 <w:sz w:val="24"/>
                 <w:szCs w:val="24"/>
-                <w:highlight w:val="yellow"/>
               </w:rPr>
               <w:t>257</w:t>
             </w:r>
@@ -12200,14 +11880,12 @@
               <w:rPr>
                 <w:sz w:val="24"/>
                 <w:szCs w:val="24"/>
-                <w:highlight w:val="yellow"/>
               </w:rPr>
             </w:pPr>
             <w:r>
               <w:rPr>
                 <w:sz w:val="24"/>
                 <w:szCs w:val="24"/>
-                <w:highlight w:val="yellow"/>
               </w:rPr>
               <w:t>OS хуже numerically; HR 1,132 non-IC, 1,434 IC</w:t>
             </w:r>
@@ -12226,14 +11904,12 @@
               <w:rPr>
                 <w:sz w:val="24"/>
                 <w:szCs w:val="24"/>
-                <w:highlight w:val="yellow"/>
               </w:rPr>
             </w:pPr>
             <w:r>
               <w:rPr>
                 <w:sz w:val="24"/>
                 <w:szCs w:val="24"/>
-                <w:highlight w:val="yellow"/>
               </w:rPr>
               <w:t>futility for survival benefit [2]; D, высокая</w:t>
             </w:r>
@@ -12254,14 +11930,12 @@
               <w:rPr>
                 <w:sz w:val="24"/>
                 <w:szCs w:val="24"/>
-                <w:highlight w:val="yellow"/>
               </w:rPr>
             </w:pPr>
             <w:r>
               <w:rPr>
                 <w:sz w:val="24"/>
                 <w:szCs w:val="24"/>
-                <w:highlight w:val="yellow"/>
               </w:rPr>
               <w:t>magrolimab</w:t>
             </w:r>
@@ -12280,14 +11954,12 @@
               <w:rPr>
                 <w:sz w:val="24"/>
                 <w:szCs w:val="24"/>
-                <w:highlight w:val="yellow"/>
               </w:rPr>
             </w:pPr>
             <w:r>
               <w:rPr>
                 <w:sz w:val="24"/>
                 <w:szCs w:val="24"/>
-                <w:highlight w:val="yellow"/>
               </w:rPr>
               <w:t>AML unfit, ENHANCE-3 NCT05079230</w:t>
             </w:r>
@@ -12306,14 +11978,12 @@
               <w:rPr>
                 <w:sz w:val="24"/>
                 <w:szCs w:val="24"/>
-                <w:highlight w:val="yellow"/>
               </w:rPr>
             </w:pPr>
             <w:r>
               <w:rPr>
                 <w:sz w:val="24"/>
                 <w:szCs w:val="24"/>
-                <w:highlight w:val="yellow"/>
               </w:rPr>
               <w:t>378</w:t>
             </w:r>
@@ -12332,14 +12002,12 @@
               <w:rPr>
                 <w:sz w:val="24"/>
                 <w:szCs w:val="24"/>
-                <w:highlight w:val="yellow"/>
               </w:rPr>
             </w:pPr>
             <w:r>
               <w:rPr>
                 <w:sz w:val="24"/>
                 <w:szCs w:val="24"/>
-                <w:highlight w:val="yellow"/>
               </w:rPr>
               <w:t>OS HR 1,178; fatal AE 19,0% vs 11,4%</w:t>
             </w:r>
@@ -12358,14 +12026,12 @@
               <w:rPr>
                 <w:sz w:val="24"/>
                 <w:szCs w:val="24"/>
-                <w:highlight w:val="yellow"/>
               </w:rPr>
             </w:pPr>
             <w:r>
               <w:rPr>
                 <w:sz w:val="24"/>
                 <w:szCs w:val="24"/>
-                <w:highlight w:val="yellow"/>
               </w:rPr>
               <w:t>futility + increased death risk [3]; D + unfavorable B–R, высокая</w:t>
             </w:r>
@@ -12386,14 +12052,12 @@
               <w:rPr>
                 <w:sz w:val="24"/>
                 <w:szCs w:val="24"/>
-                <w:highlight w:val="yellow"/>
               </w:rPr>
             </w:pPr>
             <w:r>
               <w:rPr>
                 <w:sz w:val="24"/>
                 <w:szCs w:val="24"/>
-                <w:highlight w:val="yellow"/>
               </w:rPr>
               <w:t>evorpacept</w:t>
             </w:r>
@@ -12412,14 +12076,12 @@
               <w:rPr>
                 <w:sz w:val="24"/>
                 <w:szCs w:val="24"/>
-                <w:highlight w:val="yellow"/>
               </w:rPr>
             </w:pPr>
             <w:r>
               <w:rPr>
                 <w:sz w:val="24"/>
                 <w:szCs w:val="24"/>
-                <w:highlight w:val="yellow"/>
               </w:rPr>
               <w:t>HNSCC ASPEN-03</w:t>
             </w:r>
@@ -12438,14 +12100,12 @@
               <w:rPr>
                 <w:sz w:val="24"/>
                 <w:szCs w:val="24"/>
-                <w:highlight w:val="yellow"/>
               </w:rPr>
             </w:pPr>
             <w:r>
               <w:rPr>
                 <w:sz w:val="24"/>
                 <w:szCs w:val="24"/>
-                <w:highlight w:val="yellow"/>
               </w:rPr>
               <w:t xml:space="preserve">189 </w:t>
             </w:r>
@@ -12464,14 +12124,12 @@
               <w:rPr>
                 <w:sz w:val="24"/>
                 <w:szCs w:val="24"/>
-                <w:highlight w:val="yellow"/>
               </w:rPr>
             </w:pPr>
             <w:r>
               <w:rPr>
                 <w:sz w:val="24"/>
                 <w:szCs w:val="24"/>
-                <w:highlight w:val="yellow"/>
               </w:rPr>
               <w:t>primary efficacy criterion not met</w:t>
             </w:r>
@@ -12490,14 +12148,12 @@
               <w:rPr>
                 <w:sz w:val="24"/>
                 <w:szCs w:val="24"/>
-                <w:highlight w:val="yellow"/>
               </w:rPr>
             </w:pPr>
             <w:r>
               <w:rPr>
                 <w:sz w:val="24"/>
                 <w:szCs w:val="24"/>
-                <w:highlight w:val="yellow"/>
               </w:rPr>
               <w:t>lack of efficacy; registrational HNSCC program not advanced [7]; D, средняя–высокая</w:t>
             </w:r>
@@ -12518,14 +12174,12 @@
               <w:rPr>
                 <w:sz w:val="24"/>
                 <w:szCs w:val="24"/>
-                <w:highlight w:val="yellow"/>
               </w:rPr>
             </w:pPr>
             <w:r>
               <w:rPr>
                 <w:sz w:val="24"/>
                 <w:szCs w:val="24"/>
-                <w:highlight w:val="yellow"/>
               </w:rPr>
               <w:t>evorpacept</w:t>
             </w:r>
@@ -12544,14 +12198,12 @@
               <w:rPr>
                 <w:sz w:val="24"/>
                 <w:szCs w:val="24"/>
-                <w:highlight w:val="yellow"/>
               </w:rPr>
             </w:pPr>
             <w:r>
               <w:rPr>
                 <w:sz w:val="24"/>
                 <w:szCs w:val="24"/>
-                <w:highlight w:val="yellow"/>
               </w:rPr>
               <w:t>HNSCC ASPEN-04</w:t>
             </w:r>
@@ -12570,14 +12222,12 @@
               <w:rPr>
                 <w:sz w:val="24"/>
                 <w:szCs w:val="24"/>
-                <w:highlight w:val="yellow"/>
               </w:rPr>
             </w:pPr>
             <w:r>
               <w:rPr>
                 <w:sz w:val="24"/>
                 <w:szCs w:val="24"/>
-                <w:highlight w:val="yellow"/>
               </w:rPr>
               <w:t>172</w:t>
             </w:r>
@@ -12596,14 +12246,12 @@
               <w:rPr>
                 <w:sz w:val="24"/>
                 <w:szCs w:val="24"/>
-                <w:highlight w:val="yellow"/>
               </w:rPr>
             </w:pPr>
             <w:r>
               <w:rPr>
                 <w:sz w:val="24"/>
                 <w:szCs w:val="24"/>
-                <w:highlight w:val="yellow"/>
               </w:rPr>
               <w:t>ORR/PFS no advantage</w:t>
             </w:r>
@@ -12622,14 +12270,12 @@
               <w:rPr>
                 <w:sz w:val="24"/>
                 <w:szCs w:val="24"/>
-                <w:highlight w:val="yellow"/>
               </w:rPr>
             </w:pPr>
             <w:r>
               <w:rPr>
                 <w:sz w:val="24"/>
                 <w:szCs w:val="24"/>
-                <w:highlight w:val="yellow"/>
               </w:rPr>
               <w:t>lack of efficacy [7]; D, средняя–высокая</w:t>
             </w:r>
@@ -12650,14 +12296,12 @@
               <w:rPr>
                 <w:sz w:val="24"/>
                 <w:szCs w:val="24"/>
-                <w:highlight w:val="yellow"/>
               </w:rPr>
             </w:pPr>
             <w:r>
               <w:rPr>
                 <w:sz w:val="24"/>
                 <w:szCs w:val="24"/>
-                <w:highlight w:val="yellow"/>
               </w:rPr>
               <w:t>magrolimab</w:t>
             </w:r>
@@ -12676,14 +12320,12 @@
               <w:rPr>
                 <w:sz w:val="24"/>
                 <w:szCs w:val="24"/>
-                <w:highlight w:val="yellow"/>
               </w:rPr>
             </w:pPr>
             <w:r>
               <w:rPr>
                 <w:sz w:val="24"/>
                 <w:szCs w:val="24"/>
-                <w:highlight w:val="yellow"/>
               </w:rPr>
               <w:t>mCRC ELEVATE NCT05330429</w:t>
             </w:r>
@@ -12702,14 +12344,12 @@
               <w:rPr>
                 <w:sz w:val="24"/>
                 <w:szCs w:val="24"/>
-                <w:highlight w:val="yellow"/>
               </w:rPr>
             </w:pPr>
             <w:r>
               <w:rPr>
                 <w:sz w:val="24"/>
                 <w:szCs w:val="24"/>
-                <w:highlight w:val="yellow"/>
               </w:rPr>
               <w:t xml:space="preserve">67 </w:t>
             </w:r>
@@ -12728,14 +12368,12 @@
               <w:rPr>
                 <w:sz w:val="24"/>
                 <w:szCs w:val="24"/>
-                <w:highlight w:val="yellow"/>
               </w:rPr>
             </w:pPr>
             <w:r>
               <w:rPr>
                 <w:sz w:val="24"/>
                 <w:szCs w:val="24"/>
-                <w:highlight w:val="yellow"/>
               </w:rPr>
               <w:t>PFS 6,2 vs 6,7, HR 0,956</w:t>
             </w:r>
@@ -12754,14 +12392,12 @@
               <w:rPr>
                 <w:sz w:val="24"/>
                 <w:szCs w:val="24"/>
-                <w:highlight w:val="yellow"/>
               </w:rPr>
             </w:pPr>
             <w:r>
               <w:rPr>
                 <w:sz w:val="24"/>
                 <w:szCs w:val="24"/>
-                <w:highlight w:val="yellow"/>
               </w:rPr>
               <w:t>early closure during global magrolimab discontinuation [8]; C, недостаточно для D</w:t>
             </w:r>
@@ -12782,14 +12418,12 @@
               <w:rPr>
                 <w:sz w:val="24"/>
                 <w:szCs w:val="24"/>
-                <w:highlight w:val="yellow"/>
               </w:rPr>
             </w:pPr>
             <w:r>
               <w:rPr>
                 <w:sz w:val="24"/>
                 <w:szCs w:val="24"/>
-                <w:highlight w:val="yellow"/>
               </w:rPr>
               <w:t>CC-90002</w:t>
             </w:r>
@@ -12808,14 +12442,12 @@
               <w:rPr>
                 <w:sz w:val="24"/>
                 <w:szCs w:val="24"/>
-                <w:highlight w:val="yellow"/>
               </w:rPr>
             </w:pPr>
             <w:r>
               <w:rPr>
                 <w:sz w:val="24"/>
                 <w:szCs w:val="24"/>
-                <w:highlight w:val="yellow"/>
               </w:rPr>
               <w:t>R/R AML/MDS</w:t>
             </w:r>
@@ -12834,14 +12466,12 @@
               <w:rPr>
                 <w:sz w:val="24"/>
                 <w:szCs w:val="24"/>
-                <w:highlight w:val="yellow"/>
               </w:rPr>
             </w:pPr>
             <w:r>
               <w:rPr>
                 <w:sz w:val="24"/>
                 <w:szCs w:val="24"/>
-                <w:highlight w:val="yellow"/>
               </w:rPr>
               <w:t>28</w:t>
             </w:r>
@@ -12860,14 +12490,12 @@
               <w:rPr>
                 <w:sz w:val="24"/>
                 <w:szCs w:val="24"/>
-                <w:highlight w:val="yellow"/>
               </w:rPr>
             </w:pPr>
             <w:r>
               <w:rPr>
                 <w:sz w:val="24"/>
                 <w:szCs w:val="24"/>
-                <w:highlight w:val="yellow"/>
               </w:rPr>
               <w:t>0 objective responses</w:t>
             </w:r>
@@ -12886,14 +12514,12 @@
               <w:rPr>
                 <w:sz w:val="24"/>
                 <w:szCs w:val="24"/>
-                <w:highlight w:val="yellow"/>
               </w:rPr>
             </w:pPr>
             <w:r>
               <w:rPr>
                 <w:sz w:val="24"/>
                 <w:szCs w:val="24"/>
-                <w:highlight w:val="yellow"/>
               </w:rPr>
               <w:t>lack of monotherapy activity + ADA [14]; D, средняя</w:t>
             </w:r>
@@ -12914,14 +12540,12 @@
               <w:rPr>
                 <w:sz w:val="24"/>
                 <w:szCs w:val="24"/>
-                <w:highlight w:val="yellow"/>
               </w:rPr>
             </w:pPr>
             <w:r>
               <w:rPr>
                 <w:sz w:val="24"/>
                 <w:szCs w:val="24"/>
-                <w:highlight w:val="yellow"/>
               </w:rPr>
               <w:t>SRF231</w:t>
             </w:r>
@@ -12940,14 +12564,12 @@
               <w:rPr>
                 <w:sz w:val="24"/>
                 <w:szCs w:val="24"/>
-                <w:highlight w:val="yellow"/>
               </w:rPr>
             </w:pPr>
             <w:r>
               <w:rPr>
                 <w:sz w:val="24"/>
                 <w:szCs w:val="24"/>
-                <w:highlight w:val="yellow"/>
               </w:rPr>
               <w:t>advanced solid tumors</w:t>
             </w:r>
@@ -12966,14 +12588,12 @@
               <w:rPr>
                 <w:sz w:val="24"/>
                 <w:szCs w:val="24"/>
-                <w:highlight w:val="yellow"/>
               </w:rPr>
             </w:pPr>
             <w:r>
               <w:rPr>
                 <w:sz w:val="24"/>
                 <w:szCs w:val="24"/>
-                <w:highlight w:val="yellow"/>
               </w:rPr>
               <w:t xml:space="preserve">37 </w:t>
             </w:r>
@@ -12992,14 +12612,12 @@
               <w:rPr>
                 <w:sz w:val="24"/>
                 <w:szCs w:val="24"/>
-                <w:highlight w:val="yellow"/>
               </w:rPr>
             </w:pPr>
             <w:r>
               <w:rPr>
                 <w:sz w:val="24"/>
                 <w:szCs w:val="24"/>
-                <w:highlight w:val="yellow"/>
               </w:rPr>
               <w:t>0 CR/PR</w:t>
             </w:r>
@@ -13018,14 +12636,12 @@
               <w:rPr>
                 <w:sz w:val="24"/>
                 <w:szCs w:val="24"/>
-                <w:highlight w:val="yellow"/>
               </w:rPr>
             </w:pPr>
             <w:r>
               <w:rPr>
                 <w:sz w:val="24"/>
                 <w:szCs w:val="24"/>
-                <w:highlight w:val="yellow"/>
               </w:rPr>
               <w:t>weak activity/program discontinued [15]; D, средняя</w:t>
             </w:r>
@@ -13046,14 +12662,12 @@
               <w:rPr>
                 <w:sz w:val="24"/>
                 <w:szCs w:val="24"/>
-                <w:highlight w:val="yellow"/>
               </w:rPr>
             </w:pPr>
             <w:r>
               <w:rPr>
                 <w:sz w:val="24"/>
                 <w:szCs w:val="24"/>
-                <w:highlight w:val="yellow"/>
               </w:rPr>
               <w:t>evorpacept</w:t>
             </w:r>
@@ -13072,14 +12686,12 @@
               <w:rPr>
                 <w:sz w:val="24"/>
                 <w:szCs w:val="24"/>
-                <w:highlight w:val="yellow"/>
               </w:rPr>
             </w:pPr>
             <w:r>
               <w:rPr>
                 <w:sz w:val="24"/>
                 <w:szCs w:val="24"/>
-                <w:highlight w:val="yellow"/>
               </w:rPr>
               <w:t>MSS CRC + cetuximab+pembro</w:t>
             </w:r>
@@ -13098,14 +12710,12 @@
               <w:rPr>
                 <w:sz w:val="24"/>
                 <w:szCs w:val="24"/>
-                <w:highlight w:val="yellow"/>
               </w:rPr>
             </w:pPr>
             <w:r>
               <w:rPr>
                 <w:sz w:val="24"/>
                 <w:szCs w:val="24"/>
-                <w:highlight w:val="yellow"/>
               </w:rPr>
               <w:t>16</w:t>
             </w:r>
@@ -13124,14 +12734,12 @@
               <w:rPr>
                 <w:sz w:val="24"/>
                 <w:szCs w:val="24"/>
-                <w:highlight w:val="yellow"/>
               </w:rPr>
             </w:pPr>
             <w:r>
               <w:rPr>
                 <w:sz w:val="24"/>
                 <w:szCs w:val="24"/>
-                <w:highlight w:val="yellow"/>
               </w:rPr>
               <w:t>ORR 6,3%; 2 grade 5 treatment-related immune events</w:t>
             </w:r>
@@ -13150,14 +12758,12 @@
               <w:rPr>
                 <w:sz w:val="24"/>
                 <w:szCs w:val="24"/>
-                <w:highlight w:val="yellow"/>
               </w:rPr>
             </w:pPr>
             <w:r>
               <w:rPr>
                 <w:sz w:val="24"/>
                 <w:szCs w:val="24"/>
-                <w:highlight w:val="yellow"/>
               </w:rPr>
               <w:t>toxicity/safety [32]; regimen B–R unfavorable; не class-wide conclusion</w:t>
             </w:r>
@@ -13178,14 +12784,12 @@
               <w:rPr>
                 <w:sz w:val="24"/>
                 <w:szCs w:val="24"/>
-                <w:highlight w:val="yellow"/>
               </w:rPr>
             </w:pPr>
             <w:r>
               <w:rPr>
                 <w:sz w:val="24"/>
                 <w:szCs w:val="24"/>
-                <w:highlight w:val="yellow"/>
               </w:rPr>
               <w:t>lemzoparlimab</w:t>
             </w:r>
@@ -13204,14 +12808,12 @@
               <w:rPr>
                 <w:sz w:val="24"/>
                 <w:szCs w:val="24"/>
-                <w:highlight w:val="yellow"/>
               </w:rPr>
             </w:pPr>
             <w:r>
               <w:rPr>
                 <w:sz w:val="24"/>
                 <w:szCs w:val="24"/>
-                <w:highlight w:val="yellow"/>
               </w:rPr>
               <w:t>HR-MDS Phase III NCT05709093</w:t>
             </w:r>
@@ -13230,14 +12832,12 @@
               <w:rPr>
                 <w:sz w:val="24"/>
                 <w:szCs w:val="24"/>
-                <w:highlight w:val="yellow"/>
               </w:rPr>
             </w:pPr>
             <w:r>
               <w:rPr>
                 <w:sz w:val="24"/>
                 <w:szCs w:val="24"/>
-                <w:highlight w:val="yellow"/>
               </w:rPr>
               <w:t xml:space="preserve">10 </w:t>
             </w:r>
@@ -13256,14 +12856,12 @@
               <w:rPr>
                 <w:sz w:val="24"/>
                 <w:szCs w:val="24"/>
-                <w:highlight w:val="yellow"/>
               </w:rPr>
             </w:pPr>
             <w:r>
               <w:rPr>
                 <w:sz w:val="24"/>
                 <w:szCs w:val="24"/>
-                <w:highlight w:val="yellow"/>
               </w:rPr>
               <w:t>efficacy not meaningfully assessable</w:t>
             </w:r>
@@ -13282,14 +12880,12 @@
               <w:rPr>
                 <w:sz w:val="24"/>
                 <w:szCs w:val="24"/>
-                <w:highlight w:val="yellow"/>
               </w:rPr>
             </w:pPr>
             <w:r>
               <w:rPr>
                 <w:sz w:val="24"/>
                 <w:szCs w:val="24"/>
-                <w:highlight w:val="yellow"/>
               </w:rPr>
               <w:t>company development strategy adjustment [13]; E, не D</w:t>
             </w:r>
@@ -13310,14 +12906,12 @@
               <w:rPr>
                 <w:sz w:val="24"/>
                 <w:szCs w:val="24"/>
-                <w:highlight w:val="yellow"/>
               </w:rPr>
             </w:pPr>
             <w:r>
               <w:rPr>
                 <w:sz w:val="24"/>
                 <w:szCs w:val="24"/>
-                <w:highlight w:val="yellow"/>
               </w:rPr>
               <w:t>gentulizumab</w:t>
             </w:r>
@@ -13336,14 +12930,12 @@
               <w:rPr>
                 <w:sz w:val="24"/>
                 <w:szCs w:val="24"/>
-                <w:highlight w:val="yellow"/>
               </w:rPr>
             </w:pPr>
             <w:r>
               <w:rPr>
                 <w:sz w:val="24"/>
                 <w:szCs w:val="24"/>
-                <w:highlight w:val="yellow"/>
               </w:rPr>
               <w:t>solid tumors/NHL NCT05221385</w:t>
             </w:r>
@@ -13362,14 +12954,12 @@
               <w:rPr>
                 <w:sz w:val="24"/>
                 <w:szCs w:val="24"/>
-                <w:highlight w:val="yellow"/>
               </w:rPr>
             </w:pPr>
             <w:r>
               <w:rPr>
                 <w:sz w:val="24"/>
                 <w:szCs w:val="24"/>
-                <w:highlight w:val="yellow"/>
               </w:rPr>
               <w:t>58</w:t>
             </w:r>
@@ -13388,14 +12978,12 @@
               <w:rPr>
                 <w:sz w:val="24"/>
                 <w:szCs w:val="24"/>
-                <w:highlight w:val="yellow"/>
               </w:rPr>
             </w:pPr>
             <w:r>
               <w:rPr>
                 <w:sz w:val="24"/>
                 <w:szCs w:val="24"/>
-                <w:highlight w:val="yellow"/>
               </w:rPr>
               <w:t>mature efficacy not publicly established</w:t>
             </w:r>
@@ -13414,14 +13002,12 @@
               <w:rPr>
                 <w:sz w:val="24"/>
                 <w:szCs w:val="24"/>
-                <w:highlight w:val="yellow"/>
               </w:rPr>
             </w:pPr>
             <w:r>
               <w:rPr>
                 <w:sz w:val="24"/>
                 <w:szCs w:val="24"/>
-                <w:highlight w:val="yellow"/>
               </w:rPr>
               <w:t>sponsor research-strategy change [20]; E, strategic</w:t>
             </w:r>
@@ -13442,14 +13028,12 @@
               <w:rPr>
                 <w:sz w:val="24"/>
                 <w:szCs w:val="24"/>
-                <w:highlight w:val="yellow"/>
               </w:rPr>
             </w:pPr>
             <w:r>
               <w:rPr>
                 <w:sz w:val="24"/>
                 <w:szCs w:val="24"/>
-                <w:highlight w:val="yellow"/>
               </w:rPr>
               <w:t>AO-176</w:t>
             </w:r>
@@ -13468,14 +13052,12 @@
               <w:rPr>
                 <w:sz w:val="24"/>
                 <w:szCs w:val="24"/>
-                <w:highlight w:val="yellow"/>
               </w:rPr>
             </w:pPr>
             <w:r>
               <w:rPr>
                 <w:sz w:val="24"/>
                 <w:szCs w:val="24"/>
-                <w:highlight w:val="yellow"/>
               </w:rPr>
               <w:t>advanced solid tumors</w:t>
             </w:r>
@@ -13494,7 +13076,6 @@
               <w:rPr>
                 <w:sz w:val="24"/>
                 <w:szCs w:val="24"/>
-                <w:highlight w:val="yellow"/>
               </w:rPr>
             </w:pPr>
             <w:r>
@@ -13502,7 +13083,6 @@
                 <w:rFonts w:ascii="Calibri" w:hAnsi="Calibri" w:cs="Calibri"/>
                 <w:sz w:val="24"/>
                 <w:szCs w:val="24"/>
-                <w:highlight w:val="yellow"/>
               </w:rPr>
               <w:t>ꟷ</w:t>
             </w:r>
@@ -13521,14 +13101,12 @@
               <w:rPr>
                 <w:sz w:val="24"/>
                 <w:szCs w:val="24"/>
-                <w:highlight w:val="yellow"/>
               </w:rPr>
             </w:pPr>
             <w:r>
               <w:rPr>
                 <w:sz w:val="24"/>
                 <w:szCs w:val="24"/>
-                <w:highlight w:val="yellow"/>
               </w:rPr>
               <w:t>isolated PR/SD, insufficient n</w:t>
             </w:r>
@@ -13547,14 +13125,12 @@
               <w:rPr>
                 <w:sz w:val="24"/>
                 <w:szCs w:val="24"/>
-                <w:highlight w:val="yellow"/>
               </w:rPr>
             </w:pPr>
             <w:r>
               <w:rPr>
                 <w:sz w:val="24"/>
                 <w:szCs w:val="24"/>
-                <w:highlight w:val="yellow"/>
               </w:rPr>
               <w:t>corporate/program cessation</w:t>
             </w:r>
@@ -13575,14 +13151,12 @@
               <w:rPr>
                 <w:sz w:val="24"/>
                 <w:szCs w:val="24"/>
-                <w:highlight w:val="yellow"/>
               </w:rPr>
             </w:pPr>
             <w:r>
               <w:rPr>
                 <w:sz w:val="24"/>
                 <w:szCs w:val="24"/>
-                <w:highlight w:val="yellow"/>
               </w:rPr>
               <w:t>GS-0189</w:t>
             </w:r>
@@ -13601,14 +13175,12 @@
               <w:rPr>
                 <w:sz w:val="24"/>
                 <w:szCs w:val="24"/>
-                <w:highlight w:val="yellow"/>
               </w:rPr>
             </w:pPr>
             <w:r>
               <w:rPr>
                 <w:sz w:val="24"/>
                 <w:szCs w:val="24"/>
-                <w:highlight w:val="yellow"/>
               </w:rPr>
               <w:t>lymphoma</w:t>
             </w:r>
@@ -13627,7 +13199,6 @@
               <w:rPr>
                 <w:sz w:val="24"/>
                 <w:szCs w:val="24"/>
-                <w:highlight w:val="yellow"/>
               </w:rPr>
             </w:pPr>
             <w:r>
@@ -13635,7 +13206,6 @@
                 <w:rFonts w:ascii="Calibri" w:hAnsi="Calibri" w:cs="Calibri"/>
                 <w:sz w:val="24"/>
                 <w:szCs w:val="24"/>
-                <w:highlight w:val="yellow"/>
               </w:rPr>
               <w:t>ꟷ</w:t>
             </w:r>
@@ -13654,25 +13224,136 @@
               <w:rPr>
                 <w:sz w:val="24"/>
                 <w:szCs w:val="24"/>
-                <w:highlight w:val="yellow"/>
               </w:rPr>
             </w:pPr>
             <w:r>
               <w:rPr>
                 <w:sz w:val="24"/>
                 <w:szCs w:val="24"/>
-                <w:highlight w:val="yellow"/>
-              </w:rPr>
-              <w:t xml:space="preserve">mono responses </w:t>
-            </w:r>
-            <w:r>
+              </w:rPr>
+              <w:t>mono responses absent, limited combo activity</w:t>
+            </w:r>
+          </w:p>
+        </w:tc>
+        <w:tc>
+          <w:tcPr>
+            <w:tcW w:w="1775" w:type="pct"/>
+            <w:vAlign w:val="center"/>
+          </w:tcPr>
+          <w:p>
+            <w:pPr>
+              <w:spacing w:line="240" w:lineRule="auto"/>
+              <w:ind w:firstLine="0"/>
+              <w:jc w:val="left"/>
               <w:rPr>
                 <w:sz w:val="24"/>
                 <w:szCs w:val="24"/>
-                <w:highlight w:val="yellow"/>
-              </w:rPr>
-              <w:lastRenderedPageBreak/>
-              <w:t>absent, limited combo activity</w:t>
+              </w:rPr>
+            </w:pPr>
+            <w:r>
+              <w:rPr>
+                <w:sz w:val="24"/>
+                <w:szCs w:val="24"/>
+              </w:rPr>
+              <w:t>strategic reprioritization</w:t>
+            </w:r>
+          </w:p>
+        </w:tc>
+      </w:tr>
+      <w:tr>
+        <w:tc>
+          <w:tcPr>
+            <w:tcW w:w="621" w:type="pct"/>
+            <w:vAlign w:val="center"/>
+          </w:tcPr>
+          <w:p>
+            <w:pPr>
+              <w:spacing w:line="240" w:lineRule="auto"/>
+              <w:ind w:firstLine="0"/>
+              <w:jc w:val="left"/>
+              <w:rPr>
+                <w:sz w:val="24"/>
+                <w:szCs w:val="24"/>
+              </w:rPr>
+            </w:pPr>
+            <w:r>
+              <w:rPr>
+                <w:sz w:val="24"/>
+                <w:szCs w:val="24"/>
+              </w:rPr>
+              <w:t>ASPEN-06 Phase III portion</w:t>
+            </w:r>
+          </w:p>
+        </w:tc>
+        <w:tc>
+          <w:tcPr>
+            <w:tcW w:w="1376" w:type="pct"/>
+            <w:vAlign w:val="center"/>
+          </w:tcPr>
+          <w:p>
+            <w:pPr>
+              <w:spacing w:line="240" w:lineRule="auto"/>
+              <w:ind w:firstLine="0"/>
+              <w:jc w:val="left"/>
+              <w:rPr>
+                <w:sz w:val="24"/>
+                <w:szCs w:val="24"/>
+              </w:rPr>
+            </w:pPr>
+            <w:r>
+              <w:rPr>
+                <w:sz w:val="24"/>
+                <w:szCs w:val="24"/>
+              </w:rPr>
+              <w:t>HER2+ gastric/GEJ</w:t>
+            </w:r>
+          </w:p>
+        </w:tc>
+        <w:tc>
+          <w:tcPr>
+            <w:tcW w:w="383" w:type="pct"/>
+            <w:vAlign w:val="center"/>
+          </w:tcPr>
+          <w:p>
+            <w:pPr>
+              <w:spacing w:line="240" w:lineRule="auto"/>
+              <w:ind w:firstLine="0"/>
+              <w:jc w:val="left"/>
+              <w:rPr>
+                <w:sz w:val="24"/>
+                <w:szCs w:val="24"/>
+              </w:rPr>
+            </w:pPr>
+            <w:r>
+              <w:rPr>
+                <w:sz w:val="24"/>
+                <w:szCs w:val="24"/>
+              </w:rPr>
+              <w:t>127</w:t>
+            </w:r>
+          </w:p>
+        </w:tc>
+        <w:tc>
+          <w:tcPr>
+            <w:tcW w:w="845" w:type="pct"/>
+            <w:vAlign w:val="center"/>
+          </w:tcPr>
+          <w:p>
+            <w:pPr>
+              <w:spacing w:line="240" w:lineRule="auto"/>
+              <w:ind w:firstLine="0"/>
+              <w:jc w:val="left"/>
+              <w:rPr>
+                <w:sz w:val="24"/>
+                <w:szCs w:val="24"/>
+              </w:rPr>
+            </w:pPr>
+            <w:r>
+              <w:rPr>
+                <w:sz w:val="24"/>
+                <w:szCs w:val="24"/>
+              </w:rPr>
+              <w:t>randomized Phase II ORR signal был положительным</w:t>
             </w:r>
           </w:p>
         </w:tc>
@@ -13689,146 +13370,12 @@
               <w:rPr>
                 <w:sz w:val="24"/>
                 <w:szCs w:val="24"/>
-                <w:highlight w:val="yellow"/>
               </w:rPr>
             </w:pPr>
             <w:r>
               <w:rPr>
                 <w:sz w:val="24"/>
                 <w:szCs w:val="24"/>
-                <w:highlight w:val="yellow"/>
-              </w:rPr>
-              <w:lastRenderedPageBreak/>
-              <w:t>strategic reprioritization</w:t>
-            </w:r>
-          </w:p>
-        </w:tc>
-      </w:tr>
-      <w:tr>
-        <w:tc>
-          <w:tcPr>
-            <w:tcW w:w="621" w:type="pct"/>
-            <w:vAlign w:val="center"/>
-          </w:tcPr>
-          <w:p>
-            <w:pPr>
-              <w:spacing w:line="240" w:lineRule="auto"/>
-              <w:ind w:firstLine="0"/>
-              <w:jc w:val="left"/>
-              <w:rPr>
-                <w:sz w:val="24"/>
-                <w:szCs w:val="24"/>
-                <w:highlight w:val="yellow"/>
-              </w:rPr>
-            </w:pPr>
-            <w:r>
-              <w:rPr>
-                <w:sz w:val="24"/>
-                <w:szCs w:val="24"/>
-                <w:highlight w:val="yellow"/>
-              </w:rPr>
-              <w:t>ASPEN-06 Phase III portion</w:t>
-            </w:r>
-          </w:p>
-        </w:tc>
-        <w:tc>
-          <w:tcPr>
-            <w:tcW w:w="1376" w:type="pct"/>
-            <w:vAlign w:val="center"/>
-          </w:tcPr>
-          <w:p>
-            <w:pPr>
-              <w:spacing w:line="240" w:lineRule="auto"/>
-              <w:ind w:firstLine="0"/>
-              <w:jc w:val="left"/>
-              <w:rPr>
-                <w:sz w:val="24"/>
-                <w:szCs w:val="24"/>
-                <w:highlight w:val="yellow"/>
-              </w:rPr>
-            </w:pPr>
-            <w:r>
-              <w:rPr>
-                <w:sz w:val="24"/>
-                <w:szCs w:val="24"/>
-                <w:highlight w:val="yellow"/>
-              </w:rPr>
-              <w:t>HER2+ gastric/GEJ</w:t>
-            </w:r>
-          </w:p>
-        </w:tc>
-        <w:tc>
-          <w:tcPr>
-            <w:tcW w:w="383" w:type="pct"/>
-            <w:vAlign w:val="center"/>
-          </w:tcPr>
-          <w:p>
-            <w:pPr>
-              <w:spacing w:line="240" w:lineRule="auto"/>
-              <w:ind w:firstLine="0"/>
-              <w:jc w:val="left"/>
-              <w:rPr>
-                <w:sz w:val="24"/>
-                <w:szCs w:val="24"/>
-                <w:highlight w:val="yellow"/>
-              </w:rPr>
-            </w:pPr>
-            <w:r>
-              <w:rPr>
-                <w:sz w:val="24"/>
-                <w:szCs w:val="24"/>
-                <w:highlight w:val="yellow"/>
-              </w:rPr>
-              <w:t>127</w:t>
-            </w:r>
-          </w:p>
-        </w:tc>
-        <w:tc>
-          <w:tcPr>
-            <w:tcW w:w="845" w:type="pct"/>
-            <w:vAlign w:val="center"/>
-          </w:tcPr>
-          <w:p>
-            <w:pPr>
-              <w:spacing w:line="240" w:lineRule="auto"/>
-              <w:ind w:firstLine="0"/>
-              <w:jc w:val="left"/>
-              <w:rPr>
-                <w:sz w:val="24"/>
-                <w:szCs w:val="24"/>
-                <w:highlight w:val="yellow"/>
-              </w:rPr>
-            </w:pPr>
-            <w:r>
-              <w:rPr>
-                <w:sz w:val="24"/>
-                <w:szCs w:val="24"/>
-                <w:highlight w:val="yellow"/>
-              </w:rPr>
-              <w:t>randomized Phase II ORR signal был положительным</w:t>
-            </w:r>
-          </w:p>
-        </w:tc>
-        <w:tc>
-          <w:tcPr>
-            <w:tcW w:w="1775" w:type="pct"/>
-            <w:vAlign w:val="center"/>
-          </w:tcPr>
-          <w:p>
-            <w:pPr>
-              <w:spacing w:line="240" w:lineRule="auto"/>
-              <w:ind w:firstLine="0"/>
-              <w:jc w:val="left"/>
-              <w:rPr>
-                <w:sz w:val="24"/>
-                <w:szCs w:val="24"/>
-              </w:rPr>
-            </w:pPr>
-            <w:r>
-              <w:rPr>
-                <w:sz w:val="24"/>
-                <w:szCs w:val="24"/>
-                <w:highlight w:val="yellow"/>
               </w:rPr>
               <w:t>strategic considerations, не futility [6]; Phase II остаётся B</w:t>
             </w:r>
@@ -13842,7 +13389,6 @@
         <w:rPr>
           <w:sz w:val="24"/>
           <w:szCs w:val="24"/>
-          <w:lang w:val="ru-RU"/>
         </w:rPr>
         <w:sectPr>
           <w:pgSz w:w="16838" w:h="11906" w:orient="landscape"/>
@@ -13855,7 +13401,6 @@
         <w:rPr>
           <w:sz w:val="24"/>
           <w:szCs w:val="24"/>
-          <w:lang w:val="ru-RU"/>
         </w:rPr>
         <w:br w:type="page"/>
       </w:r>
@@ -13865,7 +13410,6 @@
         <w:pStyle w:val="Heading2"/>
       </w:pPr>
       <w:r>
-        <w:lastRenderedPageBreak/>
         <w:t xml:space="preserve">ДОЗО- И КЛАССО-ЛИМИТИРУЮЩАЯ ТОКСИЧНОСТЬ, </w:t>
       </w:r>
       <w:r>
@@ -13880,14 +13424,31 @@
         <w:rPr>
           <w:sz w:val="24"/>
           <w:szCs w:val="24"/>
+          <w:lang w:val="ru-RU"/>
         </w:rPr>
       </w:pPr>
       <w:r>
         <w:rPr>
           <w:sz w:val="24"/>
           <w:szCs w:val="24"/>
-        </w:rPr>
-        <w:t>Стратегия праймирования magrolimab позволяет частично снизить выраженность анемии при последующих введениях. Низкая начальная доза около 1 мг/кг преимущественно удаляет старые эритроциты, несущие больше провоцирующих фагоцитоз возрастных сигналов. Компенсаторный ретикулоцитоз формирует популяцию более молодых эритроцитов, которые лучше переносят поддерживающие дозы препарата. [9,39]</w:t>
+          <w:lang w:val="ru-RU"/>
+        </w:rPr>
+        <w:t xml:space="preserve">Стратегия праймирования </w:t>
+      </w:r>
+      <w:r>
+        <w:rPr>
+          <w:sz w:val="24"/>
+          <w:szCs w:val="24"/>
+        </w:rPr>
+        <w:t>magrolimab</w:t>
+      </w:r>
+      <w:r>
+        <w:rPr>
+          <w:sz w:val="24"/>
+          <w:szCs w:val="24"/>
+          <w:lang w:val="ru-RU"/>
+        </w:rPr>
+        <w:t xml:space="preserve"> позволяет частично снизить выраженность анемии при последующих введениях. Низкая начальная доза около 1 мг/кг преимущественно удаляет старые эритроциты, несущие больше провоцирующих фагоцитоз возрастных сигналов. Компенсаторный ретикулоцитоз формирует популяцию более молодых эритроцитов, которые лучше переносят поддерживающие дозы препарата. [9,39]</w:t>
       </w:r>
     </w:p>
     <w:p>
@@ -13895,14 +13456,61 @@
         <w:rPr>
           <w:sz w:val="24"/>
           <w:szCs w:val="24"/>
+          <w:lang w:val="ru-RU"/>
         </w:rPr>
       </w:pPr>
       <w:r>
         <w:rPr>
           <w:sz w:val="24"/>
           <w:szCs w:val="24"/>
-        </w:rPr>
-        <w:t>В исследовании фазы Ib у пациентов с MDS высокого риска анемия, связанная с magrolimab, наблюдалась у 37,9% участников и преимущественно соответствовала степени 3. После первого введения медианное снижение гемоглобина относительно исходного уровня составляло 0,7 г/дл. Между первой и третьей дозами падение не менее чем на 2 г/дл отмечалось у 27,2% пациентов, а не менее чем на 3 г/дл — у 10,9%. После первых циклов анемия развивалась значительно реже. [33]</w:t>
+          <w:lang w:val="ru-RU"/>
+        </w:rPr>
+        <w:t xml:space="preserve">В исследовании фазы </w:t>
+      </w:r>
+      <w:r>
+        <w:rPr>
+          <w:sz w:val="24"/>
+          <w:szCs w:val="24"/>
+        </w:rPr>
+        <w:t>Ib</w:t>
+      </w:r>
+      <w:r>
+        <w:rPr>
+          <w:sz w:val="24"/>
+          <w:szCs w:val="24"/>
+          <w:lang w:val="ru-RU"/>
+        </w:rPr>
+        <w:t xml:space="preserve"> у пациентов с </w:t>
+      </w:r>
+      <w:r>
+        <w:rPr>
+          <w:sz w:val="24"/>
+          <w:szCs w:val="24"/>
+        </w:rPr>
+        <w:t>MDS</w:t>
+      </w:r>
+      <w:r>
+        <w:rPr>
+          <w:sz w:val="24"/>
+          <w:szCs w:val="24"/>
+          <w:lang w:val="ru-RU"/>
+        </w:rPr>
+        <w:t xml:space="preserve"> высокого риска анемия, связанная с </w:t>
+      </w:r>
+      <w:r>
+        <w:rPr>
+          <w:sz w:val="24"/>
+          <w:szCs w:val="24"/>
+        </w:rPr>
+        <w:t>magrolimab</w:t>
+      </w:r>
+      <w:r>
+        <w:rPr>
+          <w:sz w:val="24"/>
+          <w:szCs w:val="24"/>
+          <w:lang w:val="ru-RU"/>
+        </w:rPr>
+        <w:t>, наблюдалась у 37,9% участников и преимущественно соответствовала степени 3. После первого введения медианное снижение гемоглобина относительно исходного уровня составляло 0,7 г/дл. Между первой и третьей дозами падение не менее чем на 2 г/дл отмечалось у 27,2% пациентов, а не менее чем на 3 г/дл — у 10,9%. После первых циклов анемия развивалась значительно реже. [33]</w:t>
       </w:r>
     </w:p>
     <w:p>
@@ -13910,14 +13518,46 @@
         <w:rPr>
           <w:sz w:val="24"/>
           <w:szCs w:val="24"/>
+          <w:lang w:val="ru-RU"/>
         </w:rPr>
       </w:pPr>
       <w:r>
         <w:rPr>
           <w:sz w:val="24"/>
           <w:szCs w:val="24"/>
-        </w:rPr>
-        <w:t>Несмотря на эффект праймирования, анемия остается наиболее убедительно подтвержденной прямой фармакодинамической токсичностью системной блокады CD47. Этот белок экспрессируется на нормальных эритроцитах, а его блокирование устраняет ингибирующий сигнал SIRPα для макрофагов. Поэтому начало лечения сопровождается усиленным удалением эритроцитов и может осложнять трансфузионную поддержку.</w:t>
+          <w:lang w:val="ru-RU"/>
+        </w:rPr>
+        <w:t xml:space="preserve">Несмотря на эффект праймирования, анемия остается наиболее убедительно подтвержденной прямой фармакодинамической токсичностью системной блокады </w:t>
+      </w:r>
+      <w:r>
+        <w:rPr>
+          <w:sz w:val="24"/>
+          <w:szCs w:val="24"/>
+        </w:rPr>
+        <w:t>CD</w:t>
+      </w:r>
+      <w:r>
+        <w:rPr>
+          <w:sz w:val="24"/>
+          <w:szCs w:val="24"/>
+          <w:lang w:val="ru-RU"/>
+        </w:rPr>
+        <w:t xml:space="preserve">47. Этот белок экспрессируется на нормальных эритроцитах, а его блокирование устраняет ингибирующий сигнал </w:t>
+      </w:r>
+      <w:r>
+        <w:rPr>
+          <w:sz w:val="24"/>
+          <w:szCs w:val="24"/>
+        </w:rPr>
+        <w:t>SIRPα</w:t>
+      </w:r>
+      <w:r>
+        <w:rPr>
+          <w:sz w:val="24"/>
+          <w:szCs w:val="24"/>
+          <w:lang w:val="ru-RU"/>
+        </w:rPr>
+        <w:t xml:space="preserve"> для макрофагов. Поэтому начало лечения сопровождается усиленным удалением эритроцитов и может осложнять трансфузионную поддержку.</w:t>
       </w:r>
     </w:p>
     <w:p>
@@ -13925,14 +13565,46 @@
         <w:rPr>
           <w:sz w:val="24"/>
           <w:szCs w:val="24"/>
+          <w:lang w:val="ru-RU"/>
         </w:rPr>
       </w:pPr>
       <w:r>
         <w:rPr>
           <w:sz w:val="24"/>
           <w:szCs w:val="24"/>
-        </w:rPr>
-        <w:t>Дополнительным ограничением является широкая экспрессия CD47 на циркулирующих клетках крови и других нормальных тканях. Это создает «антигенный резервуар»: значительная часть системно введенного препарата связывается вне опухоли, влияя на фармакокинетику, занятость рецепторов и необходимую дозу. В доклинических исследованиях magrolimab у приматов наблюдались дозозависимые анемия, ретикулоцитоз и сфероцитоз, но не картина массивного внутрисосудистого гемолиза со свободным гемоглобином в плазме. [9]</w:t>
+          <w:lang w:val="ru-RU"/>
+        </w:rPr>
+        <w:t xml:space="preserve">Дополнительным ограничением является широкая экспрессия </w:t>
+      </w:r>
+      <w:r>
+        <w:rPr>
+          <w:sz w:val="24"/>
+          <w:szCs w:val="24"/>
+        </w:rPr>
+        <w:t>CD</w:t>
+      </w:r>
+      <w:r>
+        <w:rPr>
+          <w:sz w:val="24"/>
+          <w:szCs w:val="24"/>
+          <w:lang w:val="ru-RU"/>
+        </w:rPr>
+        <w:t xml:space="preserve">47 на циркулирующих клетках крови и других нормальных тканях. Это создает «антигенный резервуар»: значительная часть системно введенного препарата связывается вне опухоли, влияя на фармакокинетику, занятость рецепторов и необходимую дозу. В доклинических исследованиях </w:t>
+      </w:r>
+      <w:r>
+        <w:rPr>
+          <w:sz w:val="24"/>
+          <w:szCs w:val="24"/>
+        </w:rPr>
+        <w:t>magrolimab</w:t>
+      </w:r>
+      <w:r>
+        <w:rPr>
+          <w:sz w:val="24"/>
+          <w:szCs w:val="24"/>
+          <w:lang w:val="ru-RU"/>
+        </w:rPr>
+        <w:t xml:space="preserve"> у приматов наблюдались дозозависимые анемия, ретикулоцитоз и сфероцитоз, но не картина массивного внутрисосудистого гемолиза со свободным гемоглобином в плазме. [9]</w:t>
       </w:r>
     </w:p>
     <w:p>
@@ -13940,14 +13612,76 @@
         <w:rPr>
           <w:sz w:val="24"/>
           <w:szCs w:val="24"/>
+          <w:lang w:val="ru-RU"/>
         </w:rPr>
       </w:pPr>
       <w:r>
         <w:rPr>
           <w:sz w:val="24"/>
           <w:szCs w:val="24"/>
-        </w:rPr>
-        <w:t>При оценке гемолиза следует различать несколько явлений. Для magrolimab характерно преимущественно внесосудистое удаление эритроцитов макрофагами, а не комплемент-опосредованный внутрисосудистый гемолиз. Лабораторные признаки гемолиза или гемагглютинации могут возникать без тяжелого клинического гемолитического синдрома. Вместе с тем прямое воздействие на CD47 не становится полностью нейтральным для эритроцитов даже при использовании препаратов следующего поколения: в исследовании фазы I IMC-002 гемолитическая анемия была зарегистрирована у 5 из 12 пациентов. [17,39,40]</w:t>
+          <w:lang w:val="ru-RU"/>
+        </w:rPr>
+        <w:t xml:space="preserve">При оценке гемолиза следует различать несколько явлений. Для </w:t>
+      </w:r>
+      <w:r>
+        <w:rPr>
+          <w:sz w:val="24"/>
+          <w:szCs w:val="24"/>
+        </w:rPr>
+        <w:t>magrolimab</w:t>
+      </w:r>
+      <w:r>
+        <w:rPr>
+          <w:sz w:val="24"/>
+          <w:szCs w:val="24"/>
+          <w:lang w:val="ru-RU"/>
+        </w:rPr>
+        <w:t xml:space="preserve"> характерно преимущественно внесосудистое удаление эритроцитов макрофагами, а не комплемент-опосредованный внутрисосудистый гемолиз. Лабораторные признаки гемолиза или гемагглютинации могут возникать без тяжелого клинического гемолитического синдрома. Вместе с тем прямое воздействие на </w:t>
+      </w:r>
+      <w:r>
+        <w:rPr>
+          <w:sz w:val="24"/>
+          <w:szCs w:val="24"/>
+        </w:rPr>
+        <w:t>CD</w:t>
+      </w:r>
+      <w:r>
+        <w:rPr>
+          <w:sz w:val="24"/>
+          <w:szCs w:val="24"/>
+          <w:lang w:val="ru-RU"/>
+        </w:rPr>
+        <w:t xml:space="preserve">47 не становится полностью нейтральным для эритроцитов даже при использовании препаратов следующего поколения: в исследовании фазы </w:t>
+      </w:r>
+      <w:r>
+        <w:rPr>
+          <w:sz w:val="24"/>
+          <w:szCs w:val="24"/>
+        </w:rPr>
+        <w:t>I</w:t>
+      </w:r>
+      <w:r>
+        <w:rPr>
+          <w:sz w:val="24"/>
+          <w:szCs w:val="24"/>
+          <w:lang w:val="ru-RU"/>
+        </w:rPr>
+        <w:t xml:space="preserve"> </w:t>
+      </w:r>
+      <w:r>
+        <w:rPr>
+          <w:sz w:val="24"/>
+          <w:szCs w:val="24"/>
+        </w:rPr>
+        <w:t>IMC</w:t>
+      </w:r>
+      <w:r>
+        <w:rPr>
+          <w:sz w:val="24"/>
+          <w:szCs w:val="24"/>
+          <w:lang w:val="ru-RU"/>
+        </w:rPr>
+        <w:t>-002 гемолитическая анемия была зарегистрирована у 5 из 12 пациентов. [17,39,40]</w:t>
       </w:r>
     </w:p>
     <w:p>
@@ -13955,6 +13689,7 @@
         <w:rPr>
           <w:sz w:val="24"/>
           <w:szCs w:val="24"/>
+          <w:lang w:val="ru-RU"/>
         </w:rPr>
         <w:sectPr>
           <w:pgSz w:w="11906" w:h="16838"/>
@@ -13977,7 +13712,6 @@
           <w:szCs w:val="24"/>
           <w:lang w:val="ru-RU"/>
         </w:rPr>
-        <w:lastRenderedPageBreak/>
         <w:t xml:space="preserve">Тромбоцитопения также может быть прямым следствием воздействия на мишень, однако ее выраженность зависит от строения </w:t>
       </w:r>
       <w:r>
@@ -14093,9 +13827,9 @@
         <w:tblLook w:val="04A0" w:firstRow="1" w:lastRow="0" w:firstColumn="1" w:lastColumn="0" w:noHBand="0" w:noVBand="1"/>
       </w:tblPr>
       <w:tblGrid>
-        <w:gridCol w:w="2983"/>
-        <w:gridCol w:w="3596"/>
-        <w:gridCol w:w="7468"/>
+        <w:gridCol w:w="2934"/>
+        <w:gridCol w:w="3539"/>
+        <w:gridCol w:w="7351"/>
         <w:gridCol w:w="550"/>
       </w:tblGrid>
       <w:tr>
@@ -14548,6 +14282,7 @@
               <w:jc w:val="left"/>
               <w:rPr>
                 <w:sz w:val="20"/>
+                <w:lang w:val="ru-RU"/>
               </w:rPr>
             </w:pPr>
           </w:p>
@@ -14655,6 +14390,7 @@
               <w:jc w:val="left"/>
               <w:rPr>
                 <w:sz w:val="20"/>
+                <w:lang w:val="ru-RU"/>
               </w:rPr>
             </w:pPr>
           </w:p>
@@ -15034,6 +14770,7 @@
               <w:jc w:val="left"/>
               <w:rPr>
                 <w:sz w:val="20"/>
+                <w:lang w:val="ru-RU"/>
               </w:rPr>
             </w:pPr>
           </w:p>
@@ -15052,6 +14789,7 @@
               <w:jc w:val="left"/>
               <w:rPr>
                 <w:sz w:val="20"/>
+                <w:lang w:val="ru-RU"/>
               </w:rPr>
             </w:pPr>
             <w:r>
@@ -15059,8 +14797,94 @@
                 <w:rStyle w:val="Strong"/>
                 <w:b w:val="0"/>
                 <w:sz w:val="20"/>
-              </w:rPr>
-              <w:t>Летальные инфекции в исследовании ENHANCE-3 (magrolimab + azacitidine + venetoclax при AML)</w:t>
+                <w:lang w:val="ru-RU"/>
+              </w:rPr>
+              <w:t xml:space="preserve">Летальные инфекции в исследовании </w:t>
+            </w:r>
+            <w:r>
+              <w:rPr>
+                <w:rStyle w:val="Strong"/>
+                <w:b w:val="0"/>
+                <w:sz w:val="20"/>
+              </w:rPr>
+              <w:t>ENHANCE</w:t>
+            </w:r>
+            <w:r>
+              <w:rPr>
+                <w:rStyle w:val="Strong"/>
+                <w:b w:val="0"/>
+                <w:sz w:val="20"/>
+                <w:lang w:val="ru-RU"/>
+              </w:rPr>
+              <w:t>-3 (</w:t>
+            </w:r>
+            <w:r>
+              <w:rPr>
+                <w:rStyle w:val="Strong"/>
+                <w:b w:val="0"/>
+                <w:sz w:val="20"/>
+              </w:rPr>
+              <w:t>magrolimab</w:t>
+            </w:r>
+            <w:r>
+              <w:rPr>
+                <w:rStyle w:val="Strong"/>
+                <w:b w:val="0"/>
+                <w:sz w:val="20"/>
+                <w:lang w:val="ru-RU"/>
+              </w:rPr>
+              <w:t xml:space="preserve"> + </w:t>
+            </w:r>
+            <w:r>
+              <w:rPr>
+                <w:rStyle w:val="Strong"/>
+                <w:b w:val="0"/>
+                <w:sz w:val="20"/>
+              </w:rPr>
+              <w:t>azacitidine</w:t>
+            </w:r>
+            <w:r>
+              <w:rPr>
+                <w:rStyle w:val="Strong"/>
+                <w:b w:val="0"/>
+                <w:sz w:val="20"/>
+                <w:lang w:val="ru-RU"/>
+              </w:rPr>
+              <w:t xml:space="preserve"> + </w:t>
+            </w:r>
+            <w:r>
+              <w:rPr>
+                <w:rStyle w:val="Strong"/>
+                <w:b w:val="0"/>
+                <w:sz w:val="20"/>
+              </w:rPr>
+              <w:t>venetoclax</w:t>
+            </w:r>
+            <w:r>
+              <w:rPr>
+                <w:rStyle w:val="Strong"/>
+                <w:b w:val="0"/>
+                <w:sz w:val="20"/>
+                <w:lang w:val="ru-RU"/>
+              </w:rPr>
+              <w:t xml:space="preserve"> при </w:t>
+            </w:r>
+            <w:r>
+              <w:rPr>
+                <w:rStyle w:val="Strong"/>
+                <w:b w:val="0"/>
+                <w:sz w:val="20"/>
+              </w:rPr>
+              <w:t>AML</w:t>
+            </w:r>
+            <w:r>
+              <w:rPr>
+                <w:rStyle w:val="Strong"/>
+                <w:b w:val="0"/>
+                <w:sz w:val="20"/>
+                <w:lang w:val="ru-RU"/>
+              </w:rPr>
+              <w:t>)</w:t>
             </w:r>
           </w:p>
         </w:tc>
@@ -15206,7 +15030,6 @@
           <w:szCs w:val="24"/>
           <w:lang w:val="ru-RU"/>
         </w:rPr>
-        <w:lastRenderedPageBreak/>
         <w:t>Новые форматы блокады CD47–SIRPα позволили частично улучшить гематологическую безопасность. Наиболее показателен evorpacept: инактивация Fc-фрагмента снижает выраженность анемии и делает профиль безопасности более благоприятным. Однако исследования ASPEN-03 и ASPEN-04 показали, что уменьшение гематологической токсичности не обеспечивает автоматически противоопухолевую эффективность. [7,41]</w:t>
       </w:r>
     </w:p>
@@ -15239,12 +15062,12 @@
         <w:tblLook w:val="04A0" w:firstRow="1" w:lastRow="0" w:firstColumn="1" w:lastColumn="0" w:noHBand="0" w:noVBand="1"/>
       </w:tblPr>
       <w:tblGrid>
-        <w:gridCol w:w="1728"/>
-        <w:gridCol w:w="2166"/>
-        <w:gridCol w:w="1800"/>
-        <w:gridCol w:w="3511"/>
-        <w:gridCol w:w="2969"/>
-        <w:gridCol w:w="2626"/>
+        <w:gridCol w:w="1700"/>
+        <w:gridCol w:w="2132"/>
+        <w:gridCol w:w="1770"/>
+        <w:gridCol w:w="3454"/>
+        <w:gridCol w:w="2921"/>
+        <w:gridCol w:w="2583"/>
       </w:tblGrid>
       <w:tr>
         <w:trPr>
@@ -16861,7 +16684,6 @@
         <w:pStyle w:val="Heading2"/>
       </w:pPr>
       <w:r>
-        <w:lastRenderedPageBreak/>
         <w:t>АНАЛИЗ НЕУДАЧ, BENEFIT–RISK И ОКОНЧАТЕЛЬНЫЕ ВЫВОДЫ</w:t>
       </w:r>
     </w:p>
@@ -16964,16 +16786,7 @@
           <w:szCs w:val="24"/>
           <w:lang w:val="ru-RU"/>
         </w:rPr>
-        <w:t xml:space="preserve">Таким образом, комбинации с антителами, имеющими активный Fc-фрагмент, предварительно перспективны. Эффективность магролимаба с азацитидином не подтверждена, а SRF231 и IMC-002, вероятно, неэффективны как монотерапия в </w:t>
-      </w:r>
-      <w:r>
-        <w:rPr>
-          <w:sz w:val="24"/>
-          <w:szCs w:val="24"/>
-          <w:lang w:val="ru-RU"/>
-        </w:rPr>
-        <w:lastRenderedPageBreak/>
-        <w:t>изученных популяциях, хотя вывод ограничен небольшими выборками. Для эритроцит-щадящих препаратов, подходов против SIRPα и Fc-модифицированных конструкций данных об эффективности пока недостаточно.</w:t>
+        <w:t>Таким образом, комбинации с антителами, имеющими активный Fc-фрагмент, предварительно перспективны. Эффективность магролимаба с азацитидином не подтверждена, а SRF231 и IMC-002, вероятно, неэффективны как монотерапия в изученных популяциях, хотя вывод ограничен небольшими выборками. Для эритроцит-щадящих препаратов, подходов против SIRPα и Fc-модифицированных конструкций данных об эффективности пока недостаточно.</w:t>
       </w:r>
     </w:p>
     <w:p>
@@ -16998,7 +16811,6 @@
         <w:pStyle w:val="Heading2"/>
       </w:pPr>
       <w:r>
-        <w:lastRenderedPageBreak/>
         <w:t>СПИСОК ИСПОЛЬЗОВАННЫХ ИСТОЧНИКОВ</w:t>
       </w:r>
     </w:p>
@@ -17015,8 +16827,145 @@
       <w:r>
         <w:rPr>
           <w:sz w:val="22"/>
-        </w:rPr>
-        <w:t>1. Sallman D. A., Garcia-Manero G., Daver N. et al. Magrolimab Plus Azacitidine Versus Placebo Plus Azacitidine in Patients With Untreated Higher-Risk Myelodysplastic Syndromes: The Phase III ENHANCE Study // Journal of Clinical Oncology. 2026. Published online July 13, 2026. DOI: 10.1200/JCO-25-00617. PMID: 42441929.</w:t>
+          <w:lang w:val="ru-RU"/>
+        </w:rPr>
+        <w:t xml:space="preserve">1. </w:t>
+      </w:r>
+      <w:r>
+        <w:rPr>
+          <w:sz w:val="22"/>
+        </w:rPr>
+        <w:t>Sallman</w:t>
+      </w:r>
+      <w:r>
+        <w:rPr>
+          <w:sz w:val="22"/>
+          <w:lang w:val="ru-RU"/>
+        </w:rPr>
+        <w:t xml:space="preserve"> </w:t>
+      </w:r>
+      <w:r>
+        <w:rPr>
+          <w:sz w:val="22"/>
+        </w:rPr>
+        <w:t>D</w:t>
+      </w:r>
+      <w:r>
+        <w:rPr>
+          <w:sz w:val="22"/>
+          <w:lang w:val="ru-RU"/>
+        </w:rPr>
+        <w:t xml:space="preserve">. </w:t>
+      </w:r>
+      <w:r>
+        <w:rPr>
+          <w:sz w:val="22"/>
+        </w:rPr>
+        <w:t>A</w:t>
+      </w:r>
+      <w:r>
+        <w:rPr>
+          <w:sz w:val="22"/>
+          <w:lang w:val="ru-RU"/>
+        </w:rPr>
+        <w:t xml:space="preserve">., </w:t>
+      </w:r>
+      <w:r>
+        <w:rPr>
+          <w:sz w:val="22"/>
+        </w:rPr>
+        <w:t>Garcia</w:t>
+      </w:r>
+      <w:r>
+        <w:rPr>
+          <w:sz w:val="22"/>
+          <w:lang w:val="ru-RU"/>
+        </w:rPr>
+        <w:t>-</w:t>
+      </w:r>
+      <w:r>
+        <w:rPr>
+          <w:sz w:val="22"/>
+        </w:rPr>
+        <w:t>Manero</w:t>
+      </w:r>
+      <w:r>
+        <w:rPr>
+          <w:sz w:val="22"/>
+          <w:lang w:val="ru-RU"/>
+        </w:rPr>
+        <w:t xml:space="preserve"> </w:t>
+      </w:r>
+      <w:r>
+        <w:rPr>
+          <w:sz w:val="22"/>
+        </w:rPr>
+        <w:t>G</w:t>
+      </w:r>
+      <w:r>
+        <w:rPr>
+          <w:sz w:val="22"/>
+          <w:lang w:val="ru-RU"/>
+        </w:rPr>
+        <w:t xml:space="preserve">., </w:t>
+      </w:r>
+      <w:r>
+        <w:rPr>
+          <w:sz w:val="22"/>
+        </w:rPr>
+        <w:t>Daver</w:t>
+      </w:r>
+      <w:r>
+        <w:rPr>
+          <w:sz w:val="22"/>
+          <w:lang w:val="ru-RU"/>
+        </w:rPr>
+        <w:t xml:space="preserve"> </w:t>
+      </w:r>
+      <w:r>
+        <w:rPr>
+          <w:sz w:val="22"/>
+        </w:rPr>
+        <w:t>N</w:t>
+      </w:r>
+      <w:r>
+        <w:rPr>
+          <w:sz w:val="22"/>
+          <w:lang w:val="ru-RU"/>
+        </w:rPr>
+        <w:t xml:space="preserve">. </w:t>
+      </w:r>
+      <w:r>
+        <w:rPr>
+          <w:sz w:val="22"/>
+        </w:rPr>
+        <w:t>et</w:t>
+      </w:r>
+      <w:r>
+        <w:rPr>
+          <w:sz w:val="22"/>
+          <w:lang w:val="ru-RU"/>
+        </w:rPr>
+        <w:t xml:space="preserve"> </w:t>
+      </w:r>
+      <w:r>
+        <w:rPr>
+          <w:sz w:val="22"/>
+        </w:rPr>
+        <w:t>al</w:t>
+      </w:r>
+      <w:r>
+        <w:rPr>
+          <w:sz w:val="22"/>
+          <w:lang w:val="ru-RU"/>
+        </w:rPr>
+        <w:t xml:space="preserve">. </w:t>
+      </w:r>
+      <w:r>
+        <w:rPr>
+          <w:sz w:val="22"/>
+        </w:rPr>
+        <w:t>Magrolimab Plus Azacitidine Versus Placebo Plus Azacitidine in Patients With Untreated Higher-Risk Myelodysplastic Syndromes: The Phase III ENHANCE Study // Journal of Clinical Oncology. 2026. Published online July 13, 2026. DOI: 10.1200/JCO-25-00617. PMID: 42441929.</w:t>
       </w:r>
     </w:p>
     <w:p>
@@ -17169,7 +17118,6 @@
         <w:rPr>
           <w:sz w:val="22"/>
         </w:rPr>
-        <w:lastRenderedPageBreak/>
         <w:t>10. Ansell S. M., Maris M. B., Lesokhin A. M. et al. Phase I Study of the CD47 Blocker TTI-621 in Patients with Relapsed or Refractory Hematologic Malignancies // Clinical Cancer Research. 2021. Vol. 27, No. 8. P. 2190–2199. DOI: 10.1158/1078-0432.CCR-20-3706. PMID: 33451977.</w:t>
       </w:r>
     </w:p>
@@ -17374,7 +17322,6 @@
         <w:rPr>
           <w:sz w:val="22"/>
         </w:rPr>
-        <w:lastRenderedPageBreak/>
         <w:t>22. Narkhede M., Bartlett N. L., Ibrahimi S. et al. A phase 1 first-in-human study of GS-0189, an anti-signal regulatory protein alpha (SIRPα) monoclonal antibody, in patients with relapsed/refractory non-Hodgkin lymphoma // EJHaem. 2023. Vol. 4, No. 2. P. 370–380. DOI: 10.1002/jha2.687. PMID: 37206279.</w:t>
       </w:r>
     </w:p>
@@ -17562,7 +17509,6 @@
         <w:rPr>
           <w:sz w:val="22"/>
         </w:rPr>
-        <w:lastRenderedPageBreak/>
         <w:t>33. Sallman D. A. et al. Magrolimab in Combination With Azacitidine in Patients With Higher-Risk Myelodysplastic Syndromes: Final Results of a Phase Ib Study // Journal of Clinical Oncology. 2023. Vol. 41, No. 15. P. 2815–2826. DOI: 10.1200/JCO.22.01794.</w:t>
       </w:r>
     </w:p>
@@ -17633,6 +17579,8 @@
         </w:rPr>
         <w:t>37. European Medicines Agency. EU/3/15/1582: Orphan designation for magrolimab for the treatment of acute myeloid leukaemia [Electronic resource]. Withdrawn from the Union Register in February 2025 at the sponsor’s request. URL: https://www.ema.europa.eu/en/medicines/human/orphan-designations/eu-3-15-1582 (accessed: 10.08.2026).</w:t>
       </w:r>
+      <w:bookmarkStart w:id="0" w:name="_GoBack"/>
+      <w:bookmarkEnd w:id="0"/>
     </w:p>
     <w:p>
       <w:pPr>
@@ -17653,7 +17601,7 @@
 </file>
 
 <file path=word/endnotes.xml><?xml version="1.0" encoding="utf-8"?>
-<w:endnotes xmlns:wpc="http://schemas.microsoft.com/office/word/2010/wordprocessingCanvas" xmlns:cx="http://schemas.microsoft.com/office/drawing/2014/chartex" xmlns:cx1="http://schemas.microsoft.com/office/drawing/2015/9/8/chartex" xmlns:mc="http://schemas.openxmlformats.org/markup-compatibility/2006" xmlns:o="urn:schemas-microsoft-com:office:office" xmlns:r="http://schemas.openxmlformats.org/officeDocument/2006/relationships" xmlns:m="http://schemas.openxmlformats.org/officeDocument/2006/math" xmlns:v="urn:schemas-microsoft-com:vml" xmlns:wp14="http://schemas.microsoft.com/office/word/2010/wordprocessingDrawing" xmlns:wp="http://schemas.openxmlformats.org/drawingml/2006/wordprocessingDrawing" xmlns:w10="urn:schemas-microsoft-com:office:word" xmlns:w="http://schemas.openxmlformats.org/wordprocessingml/2006/main" xmlns:w14="http://schemas.microsoft.com/office/word/2010/wordml" xmlns:w15="http://schemas.microsoft.com/office/word/2012/wordml" xmlns:w16se="http://schemas.microsoft.com/office/word/2015/wordml/symex" xmlns:wpg="http://schemas.microsoft.com/office/word/2010/wordprocessingGroup" xmlns:wpi="http://schemas.microsoft.com/office/word/2010/wordprocessingInk" xmlns:wne="http://schemas.microsoft.com/office/word/2006/wordml" xmlns:wps="http://schemas.microsoft.com/office/word/2010/wordprocessingShape" mc:Ignorable="w14 w15 w16se wp14">
+<w:endnotes xmlns:wpc="http://schemas.microsoft.com/office/word/2010/wordprocessingCanvas" xmlns:cx="http://schemas.microsoft.com/office/drawing/2014/chartex" xmlns:mc="http://schemas.openxmlformats.org/markup-compatibility/2006" xmlns:o="urn:schemas-microsoft-com:office:office" xmlns:r="http://schemas.openxmlformats.org/officeDocument/2006/relationships" xmlns:m="http://schemas.openxmlformats.org/officeDocument/2006/math" xmlns:v="urn:schemas-microsoft-com:vml" xmlns:wp14="http://schemas.microsoft.com/office/word/2010/wordprocessingDrawing" xmlns:wp="http://schemas.openxmlformats.org/drawingml/2006/wordprocessingDrawing" xmlns:w10="urn:schemas-microsoft-com:office:word" xmlns:w="http://schemas.openxmlformats.org/wordprocessingml/2006/main" xmlns:w14="http://schemas.microsoft.com/office/word/2010/wordml" xmlns:w15="http://schemas.microsoft.com/office/word/2012/wordml" xmlns:w16se="http://schemas.microsoft.com/office/word/2015/wordml/symex" xmlns:wpg="http://schemas.microsoft.com/office/word/2010/wordprocessingGroup" xmlns:wpi="http://schemas.microsoft.com/office/word/2010/wordprocessingInk" xmlns:wne="http://schemas.microsoft.com/office/word/2006/wordml" xmlns:wps="http://schemas.microsoft.com/office/word/2010/wordprocessingShape" mc:Ignorable="w14 w15 w16se wp14">
   <w:endnote w:type="separator" w:id="-1">
     <w:p>
       <w:pPr>
@@ -17678,7 +17626,7 @@
 </file>
 
 <file path=word/footer1.xml><?xml version="1.0" encoding="utf-8"?>
-<w:ftr xmlns:wpc="http://schemas.microsoft.com/office/word/2010/wordprocessingCanvas" xmlns:cx="http://schemas.microsoft.com/office/drawing/2014/chartex" xmlns:cx1="http://schemas.microsoft.com/office/drawing/2015/9/8/chartex" xmlns:mc="http://schemas.openxmlformats.org/markup-compatibility/2006" xmlns:o="urn:schemas-microsoft-com:office:office" xmlns:r="http://schemas.openxmlformats.org/officeDocument/2006/relationships" xmlns:m="http://schemas.openxmlformats.org/officeDocument/2006/math" xmlns:v="urn:schemas-microsoft-com:vml" xmlns:wp14="http://schemas.microsoft.com/office/word/2010/wordprocessingDrawing" xmlns:wp="http://schemas.openxmlformats.org/drawingml/2006/wordprocessingDrawing" xmlns:w10="urn:schemas-microsoft-com:office:word" xmlns:w="http://schemas.openxmlformats.org/wordprocessingml/2006/main" xmlns:w14="http://schemas.microsoft.com/office/word/2010/wordml" xmlns:w15="http://schemas.microsoft.com/office/word/2012/wordml" xmlns:w16se="http://schemas.microsoft.com/office/word/2015/wordml/symex" xmlns:wpg="http://schemas.microsoft.com/office/word/2010/wordprocessingGroup" xmlns:wpi="http://schemas.microsoft.com/office/word/2010/wordprocessingInk" xmlns:wne="http://schemas.microsoft.com/office/word/2006/wordml" xmlns:wps="http://schemas.microsoft.com/office/word/2010/wordprocessingShape" mc:Ignorable="w14 w15 w16se wp14">
+<w:ftr xmlns:wpc="http://schemas.microsoft.com/office/word/2010/wordprocessingCanvas" xmlns:cx="http://schemas.microsoft.com/office/drawing/2014/chartex" xmlns:mc="http://schemas.openxmlformats.org/markup-compatibility/2006" xmlns:o="urn:schemas-microsoft-com:office:office" xmlns:r="http://schemas.openxmlformats.org/officeDocument/2006/relationships" xmlns:m="http://schemas.openxmlformats.org/officeDocument/2006/math" xmlns:v="urn:schemas-microsoft-com:vml" xmlns:wp14="http://schemas.microsoft.com/office/word/2010/wordprocessingDrawing" xmlns:wp="http://schemas.openxmlformats.org/drawingml/2006/wordprocessingDrawing" xmlns:w10="urn:schemas-microsoft-com:office:word" xmlns:w="http://schemas.openxmlformats.org/wordprocessingml/2006/main" xmlns:w14="http://schemas.microsoft.com/office/word/2010/wordml" xmlns:w15="http://schemas.microsoft.com/office/word/2012/wordml" xmlns:w16se="http://schemas.microsoft.com/office/word/2015/wordml/symex" xmlns:wpg="http://schemas.microsoft.com/office/word/2010/wordprocessingGroup" xmlns:wpi="http://schemas.microsoft.com/office/word/2010/wordprocessingInk" xmlns:wne="http://schemas.microsoft.com/office/word/2006/wordml" xmlns:wps="http://schemas.microsoft.com/office/word/2010/wordprocessingShape" mc:Ignorable="w14 w15 w16se wp14">
   <w:p>
     <w:pPr>
       <w:pStyle w:val="Footer"/>
@@ -17697,7 +17645,7 @@
       <w:rPr>
         <w:noProof/>
       </w:rPr>
-      <w:t>2</w:t>
+      <w:t>1</w:t>
     </w:r>
     <w:r>
       <w:fldChar w:fldCharType="end"/>
@@ -17707,7 +17655,7 @@
 </file>
 
 <file path=word/footnotes.xml><?xml version="1.0" encoding="utf-8"?>
-<w:footnotes xmlns:wpc="http://schemas.microsoft.com/office/word/2010/wordprocessingCanvas" xmlns:cx="http://schemas.microsoft.com/office/drawing/2014/chartex" xmlns:cx1="http://schemas.microsoft.com/office/drawing/2015/9/8/chartex" xmlns:mc="http://schemas.openxmlformats.org/markup-compatibility/2006" xmlns:o="urn:schemas-microsoft-com:office:office" xmlns:r="http://schemas.openxmlformats.org/officeDocument/2006/relationships" xmlns:m="http://schemas.openxmlformats.org/officeDocument/2006/math" xmlns:v="urn:schemas-microsoft-com:vml" xmlns:wp14="http://schemas.microsoft.com/office/word/2010/wordprocessingDrawing" xmlns:wp="http://schemas.openxmlformats.org/drawingml/2006/wordprocessingDrawing" xmlns:w10="urn:schemas-microsoft-com:office:word" xmlns:w="http://schemas.openxmlformats.org/wordprocessingml/2006/main" xmlns:w14="http://schemas.microsoft.com/office/word/2010/wordml" xmlns:w15="http://schemas.microsoft.com/office/word/2012/wordml" xmlns:w16se="http://schemas.microsoft.com/office/word/2015/wordml/symex" xmlns:wpg="http://schemas.microsoft.com/office/word/2010/wordprocessingGroup" xmlns:wpi="http://schemas.microsoft.com/office/word/2010/wordprocessingInk" xmlns:wne="http://schemas.microsoft.com/office/word/2006/wordml" xmlns:wps="http://schemas.microsoft.com/office/word/2010/wordprocessingShape" mc:Ignorable="w14 w15 w16se wp14">
+<w:footnotes xmlns:wpc="http://schemas.microsoft.com/office/word/2010/wordprocessingCanvas" xmlns:cx="http://schemas.microsoft.com/office/drawing/2014/chartex" xmlns:mc="http://schemas.openxmlformats.org/markup-compatibility/2006" xmlns:o="urn:schemas-microsoft-com:office:office" xmlns:r="http://schemas.openxmlformats.org/officeDocument/2006/relationships" xmlns:m="http://schemas.openxmlformats.org/officeDocument/2006/math" xmlns:v="urn:schemas-microsoft-com:vml" xmlns:wp14="http://schemas.microsoft.com/office/word/2010/wordprocessingDrawing" xmlns:wp="http://schemas.openxmlformats.org/drawingml/2006/wordprocessingDrawing" xmlns:w10="urn:schemas-microsoft-com:office:word" xmlns:w="http://schemas.openxmlformats.org/wordprocessingml/2006/main" xmlns:w14="http://schemas.microsoft.com/office/word/2010/wordml" xmlns:w15="http://schemas.microsoft.com/office/word/2012/wordml" xmlns:w16se="http://schemas.microsoft.com/office/word/2015/wordml/symex" xmlns:wpg="http://schemas.microsoft.com/office/word/2010/wordprocessingGroup" xmlns:wpi="http://schemas.microsoft.com/office/word/2010/wordprocessingInk" xmlns:wne="http://schemas.microsoft.com/office/word/2006/wordml" xmlns:wps="http://schemas.microsoft.com/office/word/2010/wordprocessingShape" mc:Ignorable="w14 w15 w16se wp14">
   <w:footnote w:type="separator" w:id="-1">
     <w:p>
       <w:pPr>
@@ -17732,7 +17680,7 @@
 </file>
 
 <file path=word/numbering.xml><?xml version="1.0" encoding="utf-8"?>
-<w:numbering xmlns:wpc="http://schemas.microsoft.com/office/word/2010/wordprocessingCanvas" xmlns:cx="http://schemas.microsoft.com/office/drawing/2014/chartex" xmlns:cx1="http://schemas.microsoft.com/office/drawing/2015/9/8/chartex" xmlns:mc="http://schemas.openxmlformats.org/markup-compatibility/2006" xmlns:o="urn:schemas-microsoft-com:office:office" xmlns:r="http://schemas.openxmlformats.org/officeDocument/2006/relationships" xmlns:m="http://schemas.openxmlformats.org/officeDocument/2006/math" xmlns:v="urn:schemas-microsoft-com:vml" xmlns:wp14="http://schemas.microsoft.com/office/word/2010/wordprocessingDrawing" xmlns:wp="http://schemas.openxmlformats.org/drawingml/2006/wordprocessingDrawing" xmlns:w10="urn:schemas-microsoft-com:office:word" xmlns:w="http://schemas.openxmlformats.org/wordprocessingml/2006/main" xmlns:w14="http://schemas.microsoft.com/office/word/2010/wordml" xmlns:w15="http://schemas.microsoft.com/office/word/2012/wordml" xmlns:w16se="http://schemas.microsoft.com/office/word/2015/wordml/symex" xmlns:wpg="http://schemas.microsoft.com/office/word/2010/wordprocessingGroup" xmlns:wpi="http://schemas.microsoft.com/office/word/2010/wordprocessingInk" xmlns:wne="http://schemas.microsoft.com/office/word/2006/wordml" xmlns:wps="http://schemas.microsoft.com/office/word/2010/wordprocessingShape" mc:Ignorable="w14 w15 w16se wp14">
+<w:numbering xmlns:wpc="http://schemas.microsoft.com/office/word/2010/wordprocessingCanvas" xmlns:cx="http://schemas.microsoft.com/office/drawing/2014/chartex" xmlns:mc="http://schemas.openxmlformats.org/markup-compatibility/2006" xmlns:o="urn:schemas-microsoft-com:office:office" xmlns:r="http://schemas.openxmlformats.org/officeDocument/2006/relationships" xmlns:m="http://schemas.openxmlformats.org/officeDocument/2006/math" xmlns:v="urn:schemas-microsoft-com:vml" xmlns:wp14="http://schemas.microsoft.com/office/word/2010/wordprocessingDrawing" xmlns:wp="http://schemas.openxmlformats.org/drawingml/2006/wordprocessingDrawing" xmlns:w10="urn:schemas-microsoft-com:office:word" xmlns:w="http://schemas.openxmlformats.org/wordprocessingml/2006/main" xmlns:w14="http://schemas.microsoft.com/office/word/2010/wordml" xmlns:w15="http://schemas.microsoft.com/office/word/2012/wordml" xmlns:w16se="http://schemas.microsoft.com/office/word/2015/wordml/symex" xmlns:wpg="http://schemas.microsoft.com/office/word/2010/wordprocessingGroup" xmlns:wpi="http://schemas.microsoft.com/office/word/2010/wordprocessingInk" xmlns:wne="http://schemas.microsoft.com/office/word/2006/wordml" xmlns:wps="http://schemas.microsoft.com/office/word/2010/wordprocessingShape" mc:Ignorable="w14 w15 w16se wp14">
   <w:abstractNum w:abstractNumId="0" w15:restartNumberingAfterBreak="0">
     <w:nsid w:val="FFFFFF7C"/>
     <w:multiLevelType w:val="singleLevel"/>
@@ -29889,7 +29837,7 @@
 </file>
 
 <file path=customXml/itemProps1.xml><?xml version="1.0" encoding="utf-8"?>
-<ds:datastoreItem xmlns:ds="http://schemas.openxmlformats.org/officeDocument/2006/customXml" ds:itemID="{D2AF8907-6C88-422B-9670-68DD38869019}">
+<ds:datastoreItem xmlns:ds="http://schemas.openxmlformats.org/officeDocument/2006/customXml" ds:itemID="{C10259D8-664E-4BF0-A426-44F3AB8D39B9}">
   <ds:schemaRefs>
     <ds:schemaRef ds:uri="http://schemas.openxmlformats.org/officeDocument/2006/bibliography"/>
   </ds:schemaRefs>

</xml_diff>